<commit_message>
Atualiza modelo oficial do contrato odontologico
</commit_message>
<xml_diff>
--- a/modelo_contrato_odontologico.docx
+++ b/modelo_contrato_odontologico.docx
@@ -1,6 +1,6 @@
 
 <file path=word/document.xml><?xml version="1.0" encoding="utf-8"?>
-<w:document xmlns:wpc="http://schemas.microsoft.com/office/word/2010/wordprocessingCanvas" xmlns:cx="http://schemas.microsoft.com/office/drawing/2014/chartex" xmlns:cx1="http://schemas.microsoft.com/office/drawing/2015/9/8/chartex" xmlns:cx2="http://schemas.microsoft.com/office/drawing/2015/10/21/chartex" xmlns:cx3="http://schemas.microsoft.com/office/drawing/2016/5/9/chartex" xmlns:cx4="http://schemas.microsoft.com/office/drawing/2016/5/10/chartex" xmlns:cx5="http://schemas.microsoft.com/office/drawing/2016/5/11/chartex" xmlns:cx6="http://schemas.microsoft.com/office/drawing/2016/5/12/chartex" xmlns:cx7="http://schemas.microsoft.com/office/drawing/2016/5/13/chartex" xmlns:cx8="http://schemas.microsoft.com/office/drawing/2016/5/14/chartex" xmlns:mc="http://schemas.openxmlformats.org/markup-compatibility/2006" xmlns:aink="http://schemas.microsoft.com/office/drawing/2016/ink" xmlns:am3d="http://schemas.microsoft.com/office/drawing/2017/model3d" xmlns:o="urn:schemas-microsoft-com:office:office" xmlns:r="http://schemas.openxmlformats.org/officeDocument/2006/relationships" xmlns:m="http://schemas.openxmlformats.org/officeDocument/2006/math" xmlns:v="urn:schemas-microsoft-com:vml" xmlns:wp14="http://schemas.microsoft.com/office/word/2010/wordprocessingDrawing" xmlns:wp="http://schemas.openxmlformats.org/drawingml/2006/wordprocessingDrawing" xmlns:w10="urn:schemas-microsoft-com:office:word" xmlns:w="http://schemas.openxmlformats.org/wordprocessingml/2006/main" xmlns:w14="http://schemas.microsoft.com/office/word/2010/wordml" xmlns:w15="http://schemas.microsoft.com/office/word/2012/wordml" xmlns:w16cex="http://schemas.microsoft.com/office/word/2018/wordml/cex" xmlns:w16cid="http://schemas.microsoft.com/office/word/2016/wordml/cid" xmlns:w16="http://schemas.microsoft.com/office/word/2018/wordml" xmlns:w16sdtdh="http://schemas.microsoft.com/office/word/2020/wordml/sdtdatahash" xmlns:w16se="http://schemas.microsoft.com/office/word/2015/wordml/symex" xmlns:wpg="http://schemas.microsoft.com/office/word/2010/wordprocessingGroup" xmlns:wpi="http://schemas.microsoft.com/office/word/2010/wordprocessingInk" xmlns:wne="http://schemas.microsoft.com/office/word/2006/wordml" xmlns:wps="http://schemas.microsoft.com/office/word/2010/wordprocessingShape" mc:Ignorable="w14 w15 w16se w16cid w16 w16cex w16sdtdh wp14">
+<w:document xmlns:ve="http://schemas.openxmlformats.org/markup-compatibility/2006" xmlns:o="urn:schemas-microsoft-com:office:office" xmlns:r="http://schemas.openxmlformats.org/officeDocument/2006/relationships" xmlns:m="http://schemas.openxmlformats.org/officeDocument/2006/math" xmlns:v="urn:schemas-microsoft-com:vml" xmlns:wp="http://schemas.openxmlformats.org/drawingml/2006/wordprocessingDrawing" xmlns:w10="urn:schemas-microsoft-com:office:word" xmlns:w="http://schemas.openxmlformats.org/wordprocessingml/2006/main" xmlns:wne="http://schemas.microsoft.com/office/word/2006/wordml">
   <w:body>
     <w:p>
       <w:pPr>
@@ -25,7 +25,33 @@
           <w:szCs w:val="36"/>
           <w:lang w:eastAsia="pt-BR"/>
         </w:rPr>
-        <w:t>CONTRATO DE PRESTAÇÃO DE SERVIÇOS ODONTOLÓGICOS</w:t>
+        <w:t>CONTRATO DE PRESTAÇÃO</w:t>
+      </w:r>
+    </w:p>
+    <w:p>
+      <w:pPr>
+        <w:spacing w:before="100" w:beforeAutospacing="1" w:after="100" w:afterAutospacing="1" w:line="240" w:lineRule="auto"/>
+        <w:jc w:val="center"/>
+        <w:outlineLvl w:val="1"/>
+        <w:rPr>
+          <w:rFonts w:ascii="Times New Roman" w:eastAsia="Times New Roman" w:hAnsi="Times New Roman" w:cs="Times New Roman"/>
+          <w:b/>
+          <w:bCs/>
+          <w:sz w:val="36"/>
+          <w:szCs w:val="36"/>
+          <w:lang w:eastAsia="pt-BR"/>
+        </w:rPr>
+      </w:pPr>
+      <w:r>
+        <w:rPr>
+          <w:rFonts w:ascii="Times New Roman" w:eastAsia="Times New Roman" w:hAnsi="Times New Roman" w:cs="Times New Roman"/>
+          <w:b/>
+          <w:bCs/>
+          <w:sz w:val="36"/>
+          <w:szCs w:val="36"/>
+          <w:lang w:eastAsia="pt-BR"/>
+        </w:rPr>
+        <w:t xml:space="preserve"> DE SERVIÇOS ODONTOLÓGICOS</w:t>
       </w:r>
     </w:p>
     <w:p>
@@ -53,20 +79,22 @@
     <w:p>
       <w:pPr>
         <w:spacing w:before="100" w:beforeAutospacing="1" w:after="100" w:afterAutospacing="1" w:line="240" w:lineRule="auto"/>
-        <w:rPr>
-          <w:rFonts w:ascii="Times New Roman" w:eastAsia="Times New Roman" w:hAnsi="Times New Roman" w:cs="Times New Roman"/>
-          <w:sz w:val="24"/>
-          <w:szCs w:val="24"/>
-          <w:lang w:eastAsia="pt-BR"/>
-        </w:rPr>
-      </w:pPr>
-      <w:r>
-        <w:rPr>
-          <w:rFonts w:ascii="Times New Roman" w:eastAsia="Times New Roman" w:hAnsi="Times New Roman" w:cs="Times New Roman"/>
-          <w:b/>
-          <w:bCs/>
-          <w:sz w:val="24"/>
-          <w:szCs w:val="24"/>
+        <w:jc w:val="both"/>
+        <w:rPr>
+          <w:rFonts w:ascii="Times New Roman" w:eastAsia="Times New Roman" w:hAnsi="Times New Roman" w:cs="Times New Roman"/>
+          <w:sz w:val="24"/>
+          <w:szCs w:val="24"/>
+          <w:lang w:eastAsia="pt-BR"/>
+        </w:rPr>
+      </w:pPr>
+      <w:r>
+        <w:rPr>
+          <w:rFonts w:ascii="Times New Roman" w:eastAsia="Times New Roman" w:hAnsi="Times New Roman" w:cs="Times New Roman"/>
+          <w:b/>
+          <w:bCs/>
+          <w:sz w:val="24"/>
+          <w:szCs w:val="24"/>
+          <w:highlight w:val="yellow"/>
           <w:lang w:eastAsia="pt-BR"/>
         </w:rPr>
         <w:t>{{nomeContratante}}</w:t>
@@ -76,17 +104,28 @@
           <w:rFonts w:ascii="Times New Roman" w:eastAsia="Times New Roman" w:hAnsi="Times New Roman" w:cs="Times New Roman"/>
           <w:sz w:val="24"/>
           <w:szCs w:val="24"/>
-          <w:lang w:eastAsia="pt-BR"/>
-        </w:rPr>
-        <w:t xml:space="preserve">, portador do documento </w:t>
-      </w:r>
-      <w:r>
-        <w:rPr>
-          <w:rFonts w:ascii="Times New Roman" w:eastAsia="Times New Roman" w:hAnsi="Times New Roman" w:cs="Times New Roman"/>
-          <w:b/>
-          <w:bCs/>
-          <w:sz w:val="24"/>
-          <w:szCs w:val="24"/>
+          <w:highlight w:val="yellow"/>
+          <w:lang w:eastAsia="pt-BR"/>
+        </w:rPr>
+        <w:t>,</w:t>
+      </w:r>
+      <w:r>
+        <w:rPr>
+          <w:rFonts w:ascii="Times New Roman" w:eastAsia="Times New Roman" w:hAnsi="Times New Roman" w:cs="Times New Roman"/>
+          <w:sz w:val="24"/>
+          <w:szCs w:val="24"/>
+          <w:lang w:eastAsia="pt-BR"/>
+        </w:rPr>
+        <w:t xml:space="preserve"> portador do documento </w:t>
+      </w:r>
+      <w:r>
+        <w:rPr>
+          <w:rFonts w:ascii="Times New Roman" w:eastAsia="Times New Roman" w:hAnsi="Times New Roman" w:cs="Times New Roman"/>
+          <w:b/>
+          <w:bCs/>
+          <w:sz w:val="24"/>
+          <w:szCs w:val="24"/>
+          <w:highlight w:val="yellow"/>
           <w:lang w:eastAsia="pt-BR"/>
         </w:rPr>
         <w:t>{{cpfContratante}}</w:t>
@@ -98,7 +137,121 @@
           <w:szCs w:val="24"/>
           <w:lang w:eastAsia="pt-BR"/>
         </w:rPr>
-        <w:t xml:space="preserve"> residente e domiciliado em {{cidadeContratante}}, à rua {{enderecoContratante}}, bairro {{bairroContratante}}, CEP {{cepContratante}}, doravante denominado CONTRATANTE e de outro lado {{nomeContratada}}, CPF/CNPJ nº {{cpfCnpjContratada}} doravante denominada CONTRATADA, resolvem de comum acordo celebrar o presente Contrato para Prestação de Serviços Odontológicos, com fulcro no Código Civil, Código de Defesa do Consumidor e no Código de Ética Odontológico o qual se regerá pelas seguintes cláusulas e condições:</w:t>
+        <w:t xml:space="preserve"> residente e domiciliado em </w:t>
+      </w:r>
+      <w:r>
+        <w:rPr>
+          <w:rFonts w:ascii="Times New Roman" w:eastAsia="Times New Roman" w:hAnsi="Times New Roman" w:cs="Times New Roman"/>
+          <w:sz w:val="24"/>
+          <w:szCs w:val="24"/>
+          <w:highlight w:val="yellow"/>
+          <w:lang w:eastAsia="pt-BR"/>
+        </w:rPr>
+        <w:t>{{cidadeContratante}},</w:t>
+      </w:r>
+      <w:r>
+        <w:rPr>
+          <w:rFonts w:ascii="Times New Roman" w:eastAsia="Times New Roman" w:hAnsi="Times New Roman" w:cs="Times New Roman"/>
+          <w:sz w:val="24"/>
+          <w:szCs w:val="24"/>
+          <w:lang w:eastAsia="pt-BR"/>
+        </w:rPr>
+        <w:t xml:space="preserve"> à rua </w:t>
+      </w:r>
+      <w:r>
+        <w:rPr>
+          <w:rFonts w:ascii="Times New Roman" w:eastAsia="Times New Roman" w:hAnsi="Times New Roman" w:cs="Times New Roman"/>
+          <w:sz w:val="24"/>
+          <w:szCs w:val="24"/>
+          <w:highlight w:val="yellow"/>
+          <w:lang w:eastAsia="pt-BR"/>
+        </w:rPr>
+        <w:t>{{enderecoContratante}},</w:t>
+      </w:r>
+      <w:r>
+        <w:rPr>
+          <w:rFonts w:ascii="Times New Roman" w:eastAsia="Times New Roman" w:hAnsi="Times New Roman" w:cs="Times New Roman"/>
+          <w:sz w:val="24"/>
+          <w:szCs w:val="24"/>
+          <w:lang w:eastAsia="pt-BR"/>
+        </w:rPr>
+        <w:t xml:space="preserve"> bairro </w:t>
+      </w:r>
+      <w:r>
+        <w:rPr>
+          <w:rFonts w:ascii="Times New Roman" w:eastAsia="Times New Roman" w:hAnsi="Times New Roman" w:cs="Times New Roman"/>
+          <w:sz w:val="24"/>
+          <w:szCs w:val="24"/>
+          <w:highlight w:val="yellow"/>
+          <w:lang w:eastAsia="pt-BR"/>
+        </w:rPr>
+        <w:t>{{bairroContratante}},</w:t>
+      </w:r>
+      <w:r>
+        <w:rPr>
+          <w:rFonts w:ascii="Times New Roman" w:eastAsia="Times New Roman" w:hAnsi="Times New Roman" w:cs="Times New Roman"/>
+          <w:sz w:val="24"/>
+          <w:szCs w:val="24"/>
+          <w:lang w:eastAsia="pt-BR"/>
+        </w:rPr>
+        <w:t xml:space="preserve"> CEP </w:t>
+      </w:r>
+      <w:r>
+        <w:rPr>
+          <w:rFonts w:ascii="Times New Roman" w:eastAsia="Times New Roman" w:hAnsi="Times New Roman" w:cs="Times New Roman"/>
+          <w:sz w:val="24"/>
+          <w:szCs w:val="24"/>
+          <w:highlight w:val="yellow"/>
+          <w:lang w:eastAsia="pt-BR"/>
+        </w:rPr>
+        <w:t>{{cepContratante}},</w:t>
+      </w:r>
+      <w:r>
+        <w:rPr>
+          <w:rFonts w:ascii="Times New Roman" w:eastAsia="Times New Roman" w:hAnsi="Times New Roman" w:cs="Times New Roman"/>
+          <w:sz w:val="24"/>
+          <w:szCs w:val="24"/>
+          <w:lang w:eastAsia="pt-BR"/>
+        </w:rPr>
+        <w:t xml:space="preserve"> doravante denominado CONTRATANTE e de outro lado </w:t>
+      </w:r>
+      <w:r>
+        <w:rPr>
+          <w:rFonts w:ascii="Times New Roman" w:eastAsia="Times New Roman" w:hAnsi="Times New Roman" w:cs="Times New Roman"/>
+          <w:sz w:val="24"/>
+          <w:szCs w:val="24"/>
+          <w:highlight w:val="yellow"/>
+          <w:lang w:eastAsia="pt-BR"/>
+        </w:rPr>
+        <w:t>{{nomeContratada}},</w:t>
+      </w:r>
+      <w:r>
+        <w:rPr>
+          <w:rFonts w:ascii="Times New Roman" w:eastAsia="Times New Roman" w:hAnsi="Times New Roman" w:cs="Times New Roman"/>
+          <w:sz w:val="24"/>
+          <w:szCs w:val="24"/>
+          <w:lang w:eastAsia="pt-BR"/>
+        </w:rPr>
+        <w:t xml:space="preserve"> CPF/CNPJ nº </w:t>
+      </w:r>
+      <w:r>
+        <w:rPr>
+          <w:rFonts w:ascii="Times New Roman" w:eastAsia="Times New Roman" w:hAnsi="Times New Roman" w:cs="Times New Roman"/>
+          <w:sz w:val="24"/>
+          <w:szCs w:val="24"/>
+          <w:highlight w:val="yellow"/>
+          <w:lang w:eastAsia="pt-BR"/>
+        </w:rPr>
+        <w:t>{{cpfCnpjContratada}}</w:t>
+      </w:r>
+      <w:r>
+        <w:rPr>
+          <w:rFonts w:ascii="Times New Roman" w:eastAsia="Times New Roman" w:hAnsi="Times New Roman" w:cs="Times New Roman"/>
+          <w:sz w:val="24"/>
+          <w:szCs w:val="24"/>
+          <w:lang w:eastAsia="pt-BR"/>
+        </w:rPr>
+        <w:t xml:space="preserve"> doravante denominada CONTRATADA, resolvem de comum acordo celebrar o presente Contrato para Prestação de Serviços Odontológicos, com fulcro no Código Civil, Código de Defesa do Consumidor e no Código de Ética Odontológico o qual se regerá pelas seguintes cláusulas e condições:</w:t>
       </w:r>
     </w:p>
     <w:p>
@@ -126,6 +279,7 @@
     <w:p>
       <w:pPr>
         <w:spacing w:before="100" w:beforeAutospacing="1" w:after="100" w:afterAutospacing="1" w:line="240" w:lineRule="auto"/>
+        <w:jc w:val="both"/>
         <w:rPr>
           <w:rFonts w:ascii="Times New Roman" w:eastAsia="Times New Roman" w:hAnsi="Times New Roman" w:cs="Times New Roman"/>
           <w:sz w:val="24"/>
@@ -151,24 +305,35 @@
           <w:szCs w:val="24"/>
           <w:lang w:eastAsia="pt-BR"/>
         </w:rPr>
-        <w:t xml:space="preserve"> O presente instrumento tem por objeto a prestação de serviços pela CONTRATADA(O) apta(o) e habilitada(o) à realização plena e segura do(s) procedimento(s) abaixo descriminado(s) no(a) paciente {{nomePaciente}}</w:t>
-      </w:r>
-    </w:p>
-    <w:p>
-      <w:pPr>
-        <w:spacing w:before="100" w:beforeAutospacing="1" w:after="100" w:afterAutospacing="1" w:line="240" w:lineRule="auto"/>
-        <w:rPr>
-          <w:rFonts w:ascii="Times New Roman" w:eastAsia="Times New Roman" w:hAnsi="Times New Roman" w:cs="Times New Roman"/>
-          <w:sz w:val="24"/>
-          <w:szCs w:val="24"/>
-          <w:lang w:eastAsia="pt-BR"/>
-        </w:rPr>
-      </w:pPr>
-      <w:r>
-        <w:rPr>
-          <w:rFonts w:ascii="Times New Roman" w:eastAsia="Times New Roman" w:hAnsi="Times New Roman" w:cs="Times New Roman"/>
-          <w:sz w:val="24"/>
-          <w:szCs w:val="24"/>
+        <w:t xml:space="preserve"> O presente instrumento tem por objeto a prestação de serviços pela CONTRATADA(O) apta(o) e habilitada(o) à realização plena e segura do(s) procedimento(s) abaixo descriminado(s) no(a) paciente </w:t>
+      </w:r>
+      <w:r>
+        <w:rPr>
+          <w:rFonts w:ascii="Times New Roman" w:eastAsia="Times New Roman" w:hAnsi="Times New Roman" w:cs="Times New Roman"/>
+          <w:sz w:val="24"/>
+          <w:szCs w:val="24"/>
+          <w:highlight w:val="yellow"/>
+          <w:lang w:eastAsia="pt-BR"/>
+        </w:rPr>
+        <w:t>{{nomePaciente}}</w:t>
+      </w:r>
+    </w:p>
+    <w:p>
+      <w:pPr>
+        <w:spacing w:before="100" w:beforeAutospacing="1" w:after="100" w:afterAutospacing="1" w:line="240" w:lineRule="auto"/>
+        <w:rPr>
+          <w:rFonts w:ascii="Times New Roman" w:eastAsia="Times New Roman" w:hAnsi="Times New Roman" w:cs="Times New Roman"/>
+          <w:sz w:val="24"/>
+          <w:szCs w:val="24"/>
+          <w:lang w:eastAsia="pt-BR"/>
+        </w:rPr>
+      </w:pPr>
+      <w:r>
+        <w:rPr>
+          <w:rFonts w:ascii="Times New Roman" w:eastAsia="Times New Roman" w:hAnsi="Times New Roman" w:cs="Times New Roman"/>
+          <w:sz w:val="24"/>
+          <w:szCs w:val="24"/>
+          <w:highlight w:val="yellow"/>
           <w:lang w:eastAsia="pt-BR"/>
         </w:rPr>
         <w:t>{{procedimentos}}</w:t>
@@ -177,6 +342,7 @@
     <w:p>
       <w:pPr>
         <w:spacing w:before="100" w:beforeAutospacing="1" w:after="100" w:afterAutospacing="1" w:line="240" w:lineRule="auto"/>
+        <w:jc w:val="both"/>
         <w:rPr>
           <w:rFonts w:ascii="Times New Roman" w:eastAsia="Times New Roman" w:hAnsi="Times New Roman" w:cs="Times New Roman"/>
           <w:sz w:val="24"/>
@@ -208,6 +374,7 @@
     <w:p>
       <w:pPr>
         <w:spacing w:before="100" w:beforeAutospacing="1" w:after="100" w:afterAutospacing="1" w:line="240" w:lineRule="auto"/>
+        <w:jc w:val="both"/>
         <w:rPr>
           <w:rFonts w:ascii="Times New Roman" w:eastAsia="Times New Roman" w:hAnsi="Times New Roman" w:cs="Times New Roman"/>
           <w:sz w:val="24"/>
@@ -239,6 +406,7 @@
     <w:p>
       <w:pPr>
         <w:spacing w:before="100" w:beforeAutospacing="1" w:after="100" w:afterAutospacing="1" w:line="240" w:lineRule="auto"/>
+        <w:jc w:val="both"/>
         <w:rPr>
           <w:rFonts w:ascii="Times New Roman" w:eastAsia="Times New Roman" w:hAnsi="Times New Roman" w:cs="Times New Roman"/>
           <w:sz w:val="24"/>
@@ -270,6 +438,7 @@
     <w:p>
       <w:pPr>
         <w:spacing w:before="100" w:beforeAutospacing="1" w:after="100" w:afterAutospacing="1" w:line="240" w:lineRule="auto"/>
+        <w:jc w:val="both"/>
         <w:rPr>
           <w:rFonts w:ascii="Times New Roman" w:eastAsia="Times New Roman" w:hAnsi="Times New Roman" w:cs="Times New Roman"/>
           <w:sz w:val="24"/>
@@ -312,6 +481,7 @@
     <w:p>
       <w:pPr>
         <w:spacing w:before="100" w:beforeAutospacing="1" w:after="100" w:afterAutospacing="1" w:line="240" w:lineRule="auto"/>
+        <w:jc w:val="both"/>
         <w:rPr>
           <w:rFonts w:ascii="Times New Roman" w:eastAsia="Times New Roman" w:hAnsi="Times New Roman" w:cs="Times New Roman"/>
           <w:sz w:val="24"/>
@@ -375,6 +545,7 @@
     <w:p>
       <w:pPr>
         <w:spacing w:before="100" w:beforeAutospacing="1" w:after="100" w:afterAutospacing="1" w:line="240" w:lineRule="auto"/>
+        <w:jc w:val="both"/>
         <w:rPr>
           <w:rFonts w:ascii="Times New Roman" w:eastAsia="Times New Roman" w:hAnsi="Times New Roman" w:cs="Times New Roman"/>
           <w:sz w:val="24"/>
@@ -400,7 +571,17 @@
           <w:szCs w:val="24"/>
           <w:lang w:eastAsia="pt-BR"/>
         </w:rPr>
-        <w:t xml:space="preserve"> As partes ajustam que, o valor cobrado corresponde aos custos dos materiais utilizados, bem como os materiais descartáveis e a mão de obra, totalizando o valor de {{valor}}.</w:t>
+        <w:t xml:space="preserve"> As partes ajustam que, o valor cobrado corresponde aos custos dos materiais utilizados, bem como os materiais descartáveis e a mão de obra, totalizando o valor de </w:t>
+      </w:r>
+      <w:r>
+        <w:rPr>
+          <w:rFonts w:ascii="Times New Roman" w:eastAsia="Times New Roman" w:hAnsi="Times New Roman" w:cs="Times New Roman"/>
+          <w:sz w:val="24"/>
+          <w:szCs w:val="24"/>
+          <w:highlight w:val="yellow"/>
+          <w:lang w:eastAsia="pt-BR"/>
+        </w:rPr>
+        <w:t>{{valor}}.</w:t>
       </w:r>
     </w:p>
     <w:p>
@@ -693,8 +874,17 @@
           <w:szCs w:val="24"/>
           <w:lang w:eastAsia="pt-BR"/>
         </w:rPr>
+        <w:t xml:space="preserve">Nos casos em que os serviços foram integralmente prestados ou, se parcialmente prestados, superarem os honorários já pagos, fica ciente desde já o paciente que </w:t>
+      </w:r>
+      <w:r>
+        <w:rPr>
+          <w:rFonts w:ascii="Times New Roman" w:eastAsia="Times New Roman" w:hAnsi="Times New Roman" w:cs="Times New Roman"/>
+          <w:sz w:val="24"/>
+          <w:szCs w:val="24"/>
+          <w:lang w:eastAsia="pt-BR"/>
+        </w:rPr>
         <w:lastRenderedPageBreak/>
-        <w:t>Nos casos em que os serviços foram integralmente prestados ou, se parcialmente prestados, superarem os honorários já pagos, fica ciente desde já o paciente que deverá arcar com os custos remanescentes dos procedimentos que foram realizados e não adimplidos, sob pena de cobranças extrajudiciais e judiciais, se necessário;</w:t>
+        <w:t>deverá arcar com os custos remanescentes dos procedimentos que foram realizados e não adimplidos, sob pena de cobranças extrajudiciais e judiciais, se necessário;</w:t>
       </w:r>
     </w:p>
     <w:p>
@@ -993,6 +1183,7 @@
     <w:p>
       <w:pPr>
         <w:spacing w:before="100" w:beforeAutospacing="1" w:after="100" w:afterAutospacing="1" w:line="240" w:lineRule="auto"/>
+        <w:jc w:val="both"/>
         <w:rPr>
           <w:rFonts w:ascii="Times New Roman" w:eastAsia="Times New Roman" w:hAnsi="Times New Roman" w:cs="Times New Roman"/>
           <w:sz w:val="24"/>
@@ -1046,6 +1237,7 @@
     <w:p>
       <w:pPr>
         <w:spacing w:before="100" w:beforeAutospacing="1" w:after="100" w:afterAutospacing="1" w:line="240" w:lineRule="auto"/>
+        <w:jc w:val="both"/>
         <w:rPr>
           <w:rFonts w:ascii="Times New Roman" w:eastAsia="Times New Roman" w:hAnsi="Times New Roman" w:cs="Times New Roman"/>
           <w:sz w:val="24"/>
@@ -1077,23 +1269,301 @@
     <w:p>
       <w:pPr>
         <w:spacing w:before="100" w:beforeAutospacing="1" w:after="100" w:afterAutospacing="1" w:line="240" w:lineRule="auto"/>
-        <w:rPr>
-          <w:rFonts w:ascii="Times New Roman" w:eastAsia="Times New Roman" w:hAnsi="Times New Roman" w:cs="Times New Roman"/>
-          <w:sz w:val="24"/>
-          <w:szCs w:val="24"/>
-          <w:lang w:eastAsia="pt-BR"/>
-        </w:rPr>
-      </w:pPr>
-      <w:r>
-        <w:rPr>
-          <w:rFonts w:ascii="Times New Roman" w:eastAsia="Times New Roman" w:hAnsi="Times New Roman" w:cs="Times New Roman"/>
-          <w:b/>
-          <w:bCs/>
+        <w:jc w:val="both"/>
+        <w:rPr>
+          <w:rFonts w:ascii="Times New Roman" w:eastAsia="Times New Roman" w:hAnsi="Times New Roman" w:cs="Times New Roman"/>
+          <w:sz w:val="24"/>
+          <w:szCs w:val="24"/>
+          <w:lang w:eastAsia="pt-BR"/>
+        </w:rPr>
+      </w:pPr>
+      <w:r>
+        <w:rPr>
+          <w:rFonts w:ascii="Times New Roman" w:eastAsia="Times New Roman" w:hAnsi="Times New Roman" w:cs="Times New Roman"/>
+          <w:b/>
+          <w:bCs/>
+          <w:sz w:val="24"/>
+          <w:szCs w:val="24"/>
+          <w:lang w:eastAsia="pt-BR"/>
+        </w:rPr>
+        <w:t>Parágrafo Primeiro:</w:t>
+      </w:r>
+      <w:r>
+        <w:rPr>
+          <w:rFonts w:ascii="Times New Roman" w:eastAsia="Times New Roman" w:hAnsi="Times New Roman" w:cs="Times New Roman"/>
+          <w:sz w:val="24"/>
+          <w:szCs w:val="24"/>
+          <w:lang w:eastAsia="pt-BR"/>
+        </w:rPr>
+        <w:t xml:space="preserve"> O(A) CONTRATADO(A) não se responsabilizará por quaisquer consequências ao tratamento, bem como por prejuízos financeiros, estéticos e morais gerados ao(à) CONTRATANTE em virtude de sua não cooperação no antes, durante e </w:t>
+      </w:r>
+      <w:r>
+        <w:rPr>
+          <w:rFonts w:ascii="Times New Roman" w:eastAsia="Times New Roman" w:hAnsi="Times New Roman" w:cs="Times New Roman"/>
           <w:sz w:val="24"/>
           <w:szCs w:val="24"/>
           <w:lang w:eastAsia="pt-BR"/>
         </w:rPr>
         <w:lastRenderedPageBreak/>
+        <w:t>após o tratamento, ou ainda pela omissão de informações relevantes para o diagnóstico (anamnese) e prognóstico do caso.</w:t>
+      </w:r>
+    </w:p>
+    <w:p>
+      <w:pPr>
+        <w:spacing w:before="100" w:beforeAutospacing="1" w:after="100" w:afterAutospacing="1" w:line="240" w:lineRule="auto"/>
+        <w:jc w:val="both"/>
+        <w:rPr>
+          <w:rFonts w:ascii="Times New Roman" w:eastAsia="Times New Roman" w:hAnsi="Times New Roman" w:cs="Times New Roman"/>
+          <w:sz w:val="24"/>
+          <w:szCs w:val="24"/>
+          <w:lang w:eastAsia="pt-BR"/>
+        </w:rPr>
+      </w:pPr>
+      <w:r>
+        <w:rPr>
+          <w:rFonts w:ascii="Times New Roman" w:eastAsia="Times New Roman" w:hAnsi="Times New Roman" w:cs="Times New Roman"/>
+          <w:b/>
+          <w:bCs/>
+          <w:sz w:val="24"/>
+          <w:szCs w:val="24"/>
+          <w:lang w:eastAsia="pt-BR"/>
+        </w:rPr>
+        <w:t>Parágrafo Segundo:</w:t>
+      </w:r>
+      <w:r>
+        <w:rPr>
+          <w:rFonts w:ascii="Times New Roman" w:eastAsia="Times New Roman" w:hAnsi="Times New Roman" w:cs="Times New Roman"/>
+          <w:sz w:val="24"/>
+          <w:szCs w:val="24"/>
+          <w:lang w:eastAsia="pt-BR"/>
+        </w:rPr>
+        <w:t xml:space="preserve"> Considera-se como não cooperação do paciente, para fins do presente instrumento, o não comparecimento às consultas agendadas, atrasos injustificados, o abandono do tratamento e a não observação das recomendações prescritas pelo profissional cirurgião dentista, dentre outras possíveis que não se exaurem com hipóteses explicitadas neste clausulado.</w:t>
+      </w:r>
+    </w:p>
+    <w:p>
+      <w:pPr>
+        <w:spacing w:before="100" w:beforeAutospacing="1" w:after="100" w:afterAutospacing="1" w:line="240" w:lineRule="auto"/>
+        <w:jc w:val="both"/>
+        <w:rPr>
+          <w:rFonts w:ascii="Times New Roman" w:eastAsia="Times New Roman" w:hAnsi="Times New Roman" w:cs="Times New Roman"/>
+          <w:sz w:val="24"/>
+          <w:szCs w:val="24"/>
+          <w:lang w:eastAsia="pt-BR"/>
+        </w:rPr>
+      </w:pPr>
+      <w:r>
+        <w:rPr>
+          <w:rFonts w:ascii="Times New Roman" w:eastAsia="Times New Roman" w:hAnsi="Times New Roman" w:cs="Times New Roman"/>
+          <w:b/>
+          <w:bCs/>
+          <w:sz w:val="24"/>
+          <w:szCs w:val="24"/>
+          <w:lang w:eastAsia="pt-BR"/>
+        </w:rPr>
+        <w:t>Parágrafo Terceiro:</w:t>
+      </w:r>
+      <w:r>
+        <w:rPr>
+          <w:rFonts w:ascii="Times New Roman" w:eastAsia="Times New Roman" w:hAnsi="Times New Roman" w:cs="Times New Roman"/>
+          <w:sz w:val="24"/>
+          <w:szCs w:val="24"/>
+          <w:lang w:eastAsia="pt-BR"/>
+        </w:rPr>
+        <w:t xml:space="preserve"> O(A) CONTRATADO(A), considerando os riscos inerentes ao tratamento, não se responsabilizará por eventuais efeitos imprevisíveis ou de baixíssima previsibilidade que venham ocorrer pela execução dos serviços, desde que observadas a boa técnica recomendável, bem como considerando para as diretrizes contidas no §1° do art. 14 da Lei n.° 8.078/90 (Código de Defesa do Consumidor), Código de Ética Odontológico, bem como as causas excludentes de responsabilidade e culpabilidade.</w:t>
+      </w:r>
+    </w:p>
+    <w:p>
+      <w:pPr>
+        <w:spacing w:before="100" w:beforeAutospacing="1" w:after="100" w:afterAutospacing="1" w:line="240" w:lineRule="auto"/>
+        <w:jc w:val="both"/>
+        <w:rPr>
+          <w:rFonts w:ascii="Times New Roman" w:eastAsia="Times New Roman" w:hAnsi="Times New Roman" w:cs="Times New Roman"/>
+          <w:sz w:val="24"/>
+          <w:szCs w:val="24"/>
+          <w:lang w:eastAsia="pt-BR"/>
+        </w:rPr>
+      </w:pPr>
+      <w:r>
+        <w:rPr>
+          <w:rFonts w:ascii="Times New Roman" w:eastAsia="Times New Roman" w:hAnsi="Times New Roman" w:cs="Times New Roman"/>
+          <w:b/>
+          <w:bCs/>
+          <w:sz w:val="24"/>
+          <w:szCs w:val="24"/>
+          <w:lang w:eastAsia="pt-BR"/>
+        </w:rPr>
+        <w:t>Parágrafo Quarto:</w:t>
+      </w:r>
+      <w:r>
+        <w:rPr>
+          <w:rFonts w:ascii="Times New Roman" w:eastAsia="Times New Roman" w:hAnsi="Times New Roman" w:cs="Times New Roman"/>
+          <w:sz w:val="24"/>
+          <w:szCs w:val="24"/>
+          <w:lang w:eastAsia="pt-BR"/>
+        </w:rPr>
+        <w:t xml:space="preserve"> A(O) CONTRATADO(A) não se responsabiliza, salvo nos casos de manejo inadequado, por qualquer defeito proveniente da máquina/equipamento/material/substância, sendo responsável o fornecedor do produto.</w:t>
+      </w:r>
+    </w:p>
+    <w:p>
+      <w:pPr>
+        <w:spacing w:before="100" w:beforeAutospacing="1" w:after="100" w:afterAutospacing="1" w:line="240" w:lineRule="auto"/>
+        <w:rPr>
+          <w:rFonts w:ascii="Times New Roman" w:eastAsia="Times New Roman" w:hAnsi="Times New Roman" w:cs="Times New Roman"/>
+          <w:sz w:val="24"/>
+          <w:szCs w:val="24"/>
+          <w:lang w:eastAsia="pt-BR"/>
+        </w:rPr>
+      </w:pPr>
+      <w:r>
+        <w:rPr>
+          <w:rFonts w:ascii="Times New Roman" w:eastAsia="Times New Roman" w:hAnsi="Times New Roman" w:cs="Times New Roman"/>
+          <w:b/>
+          <w:bCs/>
+          <w:sz w:val="24"/>
+          <w:szCs w:val="24"/>
+          <w:lang w:eastAsia="pt-BR"/>
+        </w:rPr>
+        <w:t>DA PROTEÇÃO DE DADOS</w:t>
+      </w:r>
+    </w:p>
+    <w:p>
+      <w:pPr>
+        <w:spacing w:before="100" w:beforeAutospacing="1" w:after="100" w:afterAutospacing="1" w:line="240" w:lineRule="auto"/>
+        <w:jc w:val="both"/>
+        <w:rPr>
+          <w:rFonts w:ascii="Times New Roman" w:eastAsia="Times New Roman" w:hAnsi="Times New Roman" w:cs="Times New Roman"/>
+          <w:sz w:val="24"/>
+          <w:szCs w:val="24"/>
+          <w:lang w:eastAsia="pt-BR"/>
+        </w:rPr>
+      </w:pPr>
+      <w:r>
+        <w:rPr>
+          <w:rFonts w:ascii="Times New Roman" w:eastAsia="Times New Roman" w:hAnsi="Times New Roman" w:cs="Times New Roman"/>
+          <w:b/>
+          <w:bCs/>
+          <w:sz w:val="24"/>
+          <w:szCs w:val="24"/>
+          <w:lang w:eastAsia="pt-BR"/>
+        </w:rPr>
+        <w:t>CLÁUSULA 7ª:</w:t>
+      </w:r>
+      <w:r>
+        <w:rPr>
+          <w:rFonts w:ascii="Times New Roman" w:eastAsia="Times New Roman" w:hAnsi="Times New Roman" w:cs="Times New Roman"/>
+          <w:sz w:val="24"/>
+          <w:szCs w:val="24"/>
+          <w:lang w:eastAsia="pt-BR"/>
+        </w:rPr>
+        <w:t xml:space="preserve"> Em cumprimento à Lei Geral de Proteção de Dados - LGPD (Lei 13.709/2018) a CONTRATADA informa a CONTRATANTE que os dados pessoais coletados no contexto da contratação serão utilizados para a finalidade de viabilizar a execução do presente Contrato e serão armazenados durante a sua vigência ou por período superior nos casos em que sua manutenção se justificar em outra hipótese legal prevista na LGPD.</w:t>
+      </w:r>
+    </w:p>
+    <w:p>
+      <w:pPr>
+        <w:spacing w:before="100" w:beforeAutospacing="1" w:after="100" w:afterAutospacing="1" w:line="240" w:lineRule="auto"/>
+        <w:jc w:val="both"/>
+        <w:rPr>
+          <w:rFonts w:ascii="Times New Roman" w:eastAsia="Times New Roman" w:hAnsi="Times New Roman" w:cs="Times New Roman"/>
+          <w:sz w:val="24"/>
+          <w:szCs w:val="24"/>
+          <w:lang w:eastAsia="pt-BR"/>
+        </w:rPr>
+      </w:pPr>
+      <w:r>
+        <w:rPr>
+          <w:rFonts w:ascii="Times New Roman" w:eastAsia="Times New Roman" w:hAnsi="Times New Roman" w:cs="Times New Roman"/>
+          <w:b/>
+          <w:bCs/>
+          <w:sz w:val="24"/>
+          <w:szCs w:val="24"/>
+          <w:lang w:eastAsia="pt-BR"/>
+        </w:rPr>
+        <w:t>Parágrafo Único:</w:t>
+      </w:r>
+      <w:r>
+        <w:rPr>
+          <w:rFonts w:ascii="Times New Roman" w:eastAsia="Times New Roman" w:hAnsi="Times New Roman" w:cs="Times New Roman"/>
+          <w:sz w:val="24"/>
+          <w:szCs w:val="24"/>
+          <w:lang w:eastAsia="pt-BR"/>
+        </w:rPr>
+        <w:t xml:space="preserve"> As Partes declaram-se cientes dos direitos, obrigações e penalidades aplicáveis constantes da Lei Geral de Proteção de Dados Pessoais (Lei 13.709/2018) ("LGPD"), e obrigam-se a adotar todas as medidas razoáveis para garantir, por si, bem como seu pessoal, colaboradores, empregados e subcontratados que utilizem os Dados Protegidos na extensão autorizada na referida LGPD.</w:t>
+      </w:r>
+    </w:p>
+    <w:p>
+      <w:pPr>
+        <w:spacing w:before="100" w:beforeAutospacing="1" w:after="100" w:afterAutospacing="1" w:line="240" w:lineRule="auto"/>
+        <w:rPr>
+          <w:rFonts w:ascii="Times New Roman" w:eastAsia="Times New Roman" w:hAnsi="Times New Roman" w:cs="Times New Roman"/>
+          <w:sz w:val="24"/>
+          <w:szCs w:val="24"/>
+          <w:lang w:eastAsia="pt-BR"/>
+        </w:rPr>
+      </w:pPr>
+      <w:r>
+        <w:rPr>
+          <w:rFonts w:ascii="Times New Roman" w:eastAsia="Times New Roman" w:hAnsi="Times New Roman" w:cs="Times New Roman"/>
+          <w:b/>
+          <w:bCs/>
+          <w:sz w:val="24"/>
+          <w:szCs w:val="24"/>
+          <w:lang w:eastAsia="pt-BR"/>
+        </w:rPr>
+        <w:t>DA RESCISÃO CONTRATUAL</w:t>
+      </w:r>
+    </w:p>
+    <w:p>
+      <w:pPr>
+        <w:spacing w:before="100" w:beforeAutospacing="1" w:after="100" w:afterAutospacing="1" w:line="240" w:lineRule="auto"/>
+        <w:jc w:val="both"/>
+        <w:rPr>
+          <w:rFonts w:ascii="Times New Roman" w:eastAsia="Times New Roman" w:hAnsi="Times New Roman" w:cs="Times New Roman"/>
+          <w:sz w:val="24"/>
+          <w:szCs w:val="24"/>
+          <w:lang w:eastAsia="pt-BR"/>
+        </w:rPr>
+      </w:pPr>
+      <w:r>
+        <w:rPr>
+          <w:rFonts w:ascii="Times New Roman" w:eastAsia="Times New Roman" w:hAnsi="Times New Roman" w:cs="Times New Roman"/>
+          <w:b/>
+          <w:bCs/>
+          <w:sz w:val="24"/>
+          <w:szCs w:val="24"/>
+          <w:lang w:eastAsia="pt-BR"/>
+        </w:rPr>
+        <w:t>CLÁUSULA 8ª:</w:t>
+      </w:r>
+      <w:r>
+        <w:rPr>
+          <w:rFonts w:ascii="Times New Roman" w:eastAsia="Times New Roman" w:hAnsi="Times New Roman" w:cs="Times New Roman"/>
+          <w:sz w:val="24"/>
+          <w:szCs w:val="24"/>
+          <w:lang w:eastAsia="pt-BR"/>
+        </w:rPr>
+        <w:t xml:space="preserve"> Além das hipóteses legais, o presente instrumento poderá ser rescindido pelas partes, uma vez verificada a ocorrência do descumprimento de qualquer cláusula ou condição pactuada, bem como pela falência do relacionamento profissional-paciente, sob efeitos das consequências de estilo e daquelas neste instrumento dispostas.</w:t>
+      </w:r>
+    </w:p>
+    <w:p>
+      <w:pPr>
+        <w:spacing w:before="100" w:beforeAutospacing="1" w:after="100" w:afterAutospacing="1" w:line="240" w:lineRule="auto"/>
+        <w:jc w:val="both"/>
+        <w:rPr>
+          <w:rFonts w:ascii="Times New Roman" w:eastAsia="Times New Roman" w:hAnsi="Times New Roman" w:cs="Times New Roman"/>
+          <w:sz w:val="24"/>
+          <w:szCs w:val="24"/>
+          <w:lang w:eastAsia="pt-BR"/>
+        </w:rPr>
+      </w:pPr>
+      <w:r>
+        <w:rPr>
+          <w:rFonts w:ascii="Times New Roman" w:eastAsia="Times New Roman" w:hAnsi="Times New Roman" w:cs="Times New Roman"/>
+          <w:b/>
+          <w:bCs/>
+          <w:sz w:val="24"/>
+          <w:szCs w:val="24"/>
+          <w:lang w:eastAsia="pt-BR"/>
+        </w:rPr>
         <w:t>Parágrafo Primeiro:</w:t>
       </w:r>
       <w:r>
@@ -1103,267 +1573,6 @@
           <w:szCs w:val="24"/>
           <w:lang w:eastAsia="pt-BR"/>
         </w:rPr>
-        <w:t xml:space="preserve"> O(A) CONTRATADO(A) não se responsabilizará por quaisquer consequências ao tratamento, bem como por prejuízos financeiros, estéticos e morais gerados ao(à) CONTRATANTE em virtude de sua não cooperação no antes, durante e após o tratamento, ou ainda pela omissão de informações relevantes para o diagnóstico (anamnese) e prognóstico do caso.</w:t>
-      </w:r>
-    </w:p>
-    <w:p>
-      <w:pPr>
-        <w:spacing w:before="100" w:beforeAutospacing="1" w:after="100" w:afterAutospacing="1" w:line="240" w:lineRule="auto"/>
-        <w:rPr>
-          <w:rFonts w:ascii="Times New Roman" w:eastAsia="Times New Roman" w:hAnsi="Times New Roman" w:cs="Times New Roman"/>
-          <w:sz w:val="24"/>
-          <w:szCs w:val="24"/>
-          <w:lang w:eastAsia="pt-BR"/>
-        </w:rPr>
-      </w:pPr>
-      <w:r>
-        <w:rPr>
-          <w:rFonts w:ascii="Times New Roman" w:eastAsia="Times New Roman" w:hAnsi="Times New Roman" w:cs="Times New Roman"/>
-          <w:b/>
-          <w:bCs/>
-          <w:sz w:val="24"/>
-          <w:szCs w:val="24"/>
-          <w:lang w:eastAsia="pt-BR"/>
-        </w:rPr>
-        <w:t>Parágrafo Segundo:</w:t>
-      </w:r>
-      <w:r>
-        <w:rPr>
-          <w:rFonts w:ascii="Times New Roman" w:eastAsia="Times New Roman" w:hAnsi="Times New Roman" w:cs="Times New Roman"/>
-          <w:sz w:val="24"/>
-          <w:szCs w:val="24"/>
-          <w:lang w:eastAsia="pt-BR"/>
-        </w:rPr>
-        <w:t xml:space="preserve"> Considera-se como não cooperação do paciente, para fins do presente instrumento, o não comparecimento às consultas agendadas, atrasos injustificados, o abandono do tratamento e a não observação das recomendações prescritas pelo profissional cirurgião dentista, dentre outras possíveis que não se exaurem com hipóteses explicitadas neste clausulado.</w:t>
-      </w:r>
-    </w:p>
-    <w:p>
-      <w:pPr>
-        <w:spacing w:before="100" w:beforeAutospacing="1" w:after="100" w:afterAutospacing="1" w:line="240" w:lineRule="auto"/>
-        <w:rPr>
-          <w:rFonts w:ascii="Times New Roman" w:eastAsia="Times New Roman" w:hAnsi="Times New Roman" w:cs="Times New Roman"/>
-          <w:sz w:val="24"/>
-          <w:szCs w:val="24"/>
-          <w:lang w:eastAsia="pt-BR"/>
-        </w:rPr>
-      </w:pPr>
-      <w:r>
-        <w:rPr>
-          <w:rFonts w:ascii="Times New Roman" w:eastAsia="Times New Roman" w:hAnsi="Times New Roman" w:cs="Times New Roman"/>
-          <w:b/>
-          <w:bCs/>
-          <w:sz w:val="24"/>
-          <w:szCs w:val="24"/>
-          <w:lang w:eastAsia="pt-BR"/>
-        </w:rPr>
-        <w:t>Parágrafo Terceiro:</w:t>
-      </w:r>
-      <w:r>
-        <w:rPr>
-          <w:rFonts w:ascii="Times New Roman" w:eastAsia="Times New Roman" w:hAnsi="Times New Roman" w:cs="Times New Roman"/>
-          <w:sz w:val="24"/>
-          <w:szCs w:val="24"/>
-          <w:lang w:eastAsia="pt-BR"/>
-        </w:rPr>
-        <w:t xml:space="preserve"> O(A) CONTRATADO(A), considerando os riscos inerentes ao tratamento, não se responsabilizará por eventuais efeitos imprevisíveis ou de baixíssima previsibilidade que venham ocorrer pela execução dos serviços, desde que observadas a boa técnica recomendável, bem como considerando para as diretrizes contidas no §1° do art. 14 da Lei n.° 8.078/90 (Código de Defesa do Consumidor), Código de Ética Odontológico, bem como as causas excludentes de responsabilidade e culpabilidade.</w:t>
-      </w:r>
-    </w:p>
-    <w:p>
-      <w:pPr>
-        <w:spacing w:before="100" w:beforeAutospacing="1" w:after="100" w:afterAutospacing="1" w:line="240" w:lineRule="auto"/>
-        <w:rPr>
-          <w:rFonts w:ascii="Times New Roman" w:eastAsia="Times New Roman" w:hAnsi="Times New Roman" w:cs="Times New Roman"/>
-          <w:sz w:val="24"/>
-          <w:szCs w:val="24"/>
-          <w:lang w:eastAsia="pt-BR"/>
-        </w:rPr>
-      </w:pPr>
-      <w:r>
-        <w:rPr>
-          <w:rFonts w:ascii="Times New Roman" w:eastAsia="Times New Roman" w:hAnsi="Times New Roman" w:cs="Times New Roman"/>
-          <w:b/>
-          <w:bCs/>
-          <w:sz w:val="24"/>
-          <w:szCs w:val="24"/>
-          <w:lang w:eastAsia="pt-BR"/>
-        </w:rPr>
-        <w:t>Parágrafo Quarto:</w:t>
-      </w:r>
-      <w:r>
-        <w:rPr>
-          <w:rFonts w:ascii="Times New Roman" w:eastAsia="Times New Roman" w:hAnsi="Times New Roman" w:cs="Times New Roman"/>
-          <w:sz w:val="24"/>
-          <w:szCs w:val="24"/>
-          <w:lang w:eastAsia="pt-BR"/>
-        </w:rPr>
-        <w:t xml:space="preserve"> A(O) CONTRATADO(A) não se responsabiliza, salvo nos casos de manejo inadequado, por qualquer defeito proveniente da máquina/equipamento/material/substância, sendo responsável o fornecedor do produto.</w:t>
-      </w:r>
-    </w:p>
-    <w:p>
-      <w:pPr>
-        <w:spacing w:before="100" w:beforeAutospacing="1" w:after="100" w:afterAutospacing="1" w:line="240" w:lineRule="auto"/>
-        <w:rPr>
-          <w:rFonts w:ascii="Times New Roman" w:eastAsia="Times New Roman" w:hAnsi="Times New Roman" w:cs="Times New Roman"/>
-          <w:sz w:val="24"/>
-          <w:szCs w:val="24"/>
-          <w:lang w:eastAsia="pt-BR"/>
-        </w:rPr>
-      </w:pPr>
-      <w:r>
-        <w:rPr>
-          <w:rFonts w:ascii="Times New Roman" w:eastAsia="Times New Roman" w:hAnsi="Times New Roman" w:cs="Times New Roman"/>
-          <w:b/>
-          <w:bCs/>
-          <w:sz w:val="24"/>
-          <w:szCs w:val="24"/>
-          <w:lang w:eastAsia="pt-BR"/>
-        </w:rPr>
-        <w:t>DA PROTEÇÃO DE DADOS</w:t>
-      </w:r>
-    </w:p>
-    <w:p>
-      <w:pPr>
-        <w:spacing w:before="100" w:beforeAutospacing="1" w:after="100" w:afterAutospacing="1" w:line="240" w:lineRule="auto"/>
-        <w:rPr>
-          <w:rFonts w:ascii="Times New Roman" w:eastAsia="Times New Roman" w:hAnsi="Times New Roman" w:cs="Times New Roman"/>
-          <w:sz w:val="24"/>
-          <w:szCs w:val="24"/>
-          <w:lang w:eastAsia="pt-BR"/>
-        </w:rPr>
-      </w:pPr>
-      <w:r>
-        <w:rPr>
-          <w:rFonts w:ascii="Times New Roman" w:eastAsia="Times New Roman" w:hAnsi="Times New Roman" w:cs="Times New Roman"/>
-          <w:b/>
-          <w:bCs/>
-          <w:sz w:val="24"/>
-          <w:szCs w:val="24"/>
-          <w:lang w:eastAsia="pt-BR"/>
-        </w:rPr>
-        <w:t>CLÁUSULA 7ª:</w:t>
-      </w:r>
-      <w:r>
-        <w:rPr>
-          <w:rFonts w:ascii="Times New Roman" w:eastAsia="Times New Roman" w:hAnsi="Times New Roman" w:cs="Times New Roman"/>
-          <w:sz w:val="24"/>
-          <w:szCs w:val="24"/>
-          <w:lang w:eastAsia="pt-BR"/>
-        </w:rPr>
-        <w:t xml:space="preserve"> Em cumprimento à Lei Geral de Proteção de Dados - LGPD (Lei 13.709/2018) a CONTRATADA informa a CONTRATANTE que os dados pessoais coletados no contexto da contratação serão utilizados para a finalidade de viabilizar a execução do presente Contrato e serão armazenados durante a sua vigência ou por período superior nos casos em que sua manutenção se justificar em outra hipótese legal prevista na LGPD.</w:t>
-      </w:r>
-    </w:p>
-    <w:p>
-      <w:pPr>
-        <w:spacing w:before="100" w:beforeAutospacing="1" w:after="100" w:afterAutospacing="1" w:line="240" w:lineRule="auto"/>
-        <w:rPr>
-          <w:rFonts w:ascii="Times New Roman" w:eastAsia="Times New Roman" w:hAnsi="Times New Roman" w:cs="Times New Roman"/>
-          <w:sz w:val="24"/>
-          <w:szCs w:val="24"/>
-          <w:lang w:eastAsia="pt-BR"/>
-        </w:rPr>
-      </w:pPr>
-      <w:r>
-        <w:rPr>
-          <w:rFonts w:ascii="Times New Roman" w:eastAsia="Times New Roman" w:hAnsi="Times New Roman" w:cs="Times New Roman"/>
-          <w:b/>
-          <w:bCs/>
-          <w:sz w:val="24"/>
-          <w:szCs w:val="24"/>
-          <w:lang w:eastAsia="pt-BR"/>
-        </w:rPr>
-        <w:t>Parágrafo Único:</w:t>
-      </w:r>
-      <w:r>
-        <w:rPr>
-          <w:rFonts w:ascii="Times New Roman" w:eastAsia="Times New Roman" w:hAnsi="Times New Roman" w:cs="Times New Roman"/>
-          <w:sz w:val="24"/>
-          <w:szCs w:val="24"/>
-          <w:lang w:eastAsia="pt-BR"/>
-        </w:rPr>
-        <w:t xml:space="preserve"> As Partes declaram-se cientes dos direitos, obrigações e penalidades aplicáveis constantes da Lei Geral de Proteção de Dados Pessoais (Lei 13.709/2018) ("LGPD"), e obrigam-se a adotar todas as medidas razoáveis para garantir, por si, bem como seu pessoal, colaboradores, empregados e subcontratados que utilizem os Dados Protegidos na extensão autorizada na referida LGPD.</w:t>
-      </w:r>
-    </w:p>
-    <w:p>
-      <w:pPr>
-        <w:spacing w:before="100" w:beforeAutospacing="1" w:after="100" w:afterAutospacing="1" w:line="240" w:lineRule="auto"/>
-        <w:rPr>
-          <w:rFonts w:ascii="Times New Roman" w:eastAsia="Times New Roman" w:hAnsi="Times New Roman" w:cs="Times New Roman"/>
-          <w:sz w:val="24"/>
-          <w:szCs w:val="24"/>
-          <w:lang w:eastAsia="pt-BR"/>
-        </w:rPr>
-      </w:pPr>
-      <w:r>
-        <w:rPr>
-          <w:rFonts w:ascii="Times New Roman" w:eastAsia="Times New Roman" w:hAnsi="Times New Roman" w:cs="Times New Roman"/>
-          <w:b/>
-          <w:bCs/>
-          <w:sz w:val="24"/>
-          <w:szCs w:val="24"/>
-          <w:lang w:eastAsia="pt-BR"/>
-        </w:rPr>
-        <w:t>DA RESCISÃO CONTRATUAL</w:t>
-      </w:r>
-    </w:p>
-    <w:p>
-      <w:pPr>
-        <w:spacing w:before="100" w:beforeAutospacing="1" w:after="100" w:afterAutospacing="1" w:line="240" w:lineRule="auto"/>
-        <w:rPr>
-          <w:rFonts w:ascii="Times New Roman" w:eastAsia="Times New Roman" w:hAnsi="Times New Roman" w:cs="Times New Roman"/>
-          <w:sz w:val="24"/>
-          <w:szCs w:val="24"/>
-          <w:lang w:eastAsia="pt-BR"/>
-        </w:rPr>
-      </w:pPr>
-      <w:r>
-        <w:rPr>
-          <w:rFonts w:ascii="Times New Roman" w:eastAsia="Times New Roman" w:hAnsi="Times New Roman" w:cs="Times New Roman"/>
-          <w:b/>
-          <w:bCs/>
-          <w:sz w:val="24"/>
-          <w:szCs w:val="24"/>
-          <w:lang w:eastAsia="pt-BR"/>
-        </w:rPr>
-        <w:t>CLÁUSULA 8ª:</w:t>
-      </w:r>
-      <w:r>
-        <w:rPr>
-          <w:rFonts w:ascii="Times New Roman" w:eastAsia="Times New Roman" w:hAnsi="Times New Roman" w:cs="Times New Roman"/>
-          <w:sz w:val="24"/>
-          <w:szCs w:val="24"/>
-          <w:lang w:eastAsia="pt-BR"/>
-        </w:rPr>
-        <w:t xml:space="preserve"> Além das hipóteses legais, o presente instrumento poderá ser rescindido pelas partes, uma vez verificada a ocorrência do descumprimento de qualquer cláusula ou condição pactuada, bem como pela falência do relacionamento profissional-paciente, sob efeitos das consequências de estilo e daquelas neste instrumento dispostas.</w:t>
-      </w:r>
-    </w:p>
-    <w:p>
-      <w:pPr>
-        <w:spacing w:before="100" w:beforeAutospacing="1" w:after="100" w:afterAutospacing="1" w:line="240" w:lineRule="auto"/>
-        <w:rPr>
-          <w:rFonts w:ascii="Times New Roman" w:eastAsia="Times New Roman" w:hAnsi="Times New Roman" w:cs="Times New Roman"/>
-          <w:sz w:val="24"/>
-          <w:szCs w:val="24"/>
-          <w:lang w:eastAsia="pt-BR"/>
-        </w:rPr>
-      </w:pPr>
-      <w:r>
-        <w:rPr>
-          <w:rFonts w:ascii="Times New Roman" w:eastAsia="Times New Roman" w:hAnsi="Times New Roman" w:cs="Times New Roman"/>
-          <w:b/>
-          <w:bCs/>
-          <w:sz w:val="24"/>
-          <w:szCs w:val="24"/>
-          <w:lang w:eastAsia="pt-BR"/>
-        </w:rPr>
-        <w:t>Parágrafo Primeiro:</w:t>
-      </w:r>
-      <w:r>
-        <w:rPr>
-          <w:rFonts w:ascii="Times New Roman" w:eastAsia="Times New Roman" w:hAnsi="Times New Roman" w:cs="Times New Roman"/>
-          <w:sz w:val="24"/>
-          <w:szCs w:val="24"/>
-          <w:lang w:eastAsia="pt-BR"/>
-        </w:rPr>
         <w:t xml:space="preserve"> A parte que der causa à rescisão do contrato permanecerá responsável por todas as perdas e danos ocasionados e provados à parte inocente.</w:t>
       </w:r>
     </w:p>
@@ -1392,33 +1601,43 @@
     <w:p>
       <w:pPr>
         <w:spacing w:before="100" w:beforeAutospacing="1" w:after="100" w:afterAutospacing="1" w:line="240" w:lineRule="auto"/>
-        <w:rPr>
-          <w:rFonts w:ascii="Times New Roman" w:eastAsia="Times New Roman" w:hAnsi="Times New Roman" w:cs="Times New Roman"/>
-          <w:sz w:val="24"/>
-          <w:szCs w:val="24"/>
-          <w:lang w:eastAsia="pt-BR"/>
-        </w:rPr>
-      </w:pPr>
-      <w:r>
-        <w:rPr>
-          <w:rFonts w:ascii="Times New Roman" w:eastAsia="Times New Roman" w:hAnsi="Times New Roman" w:cs="Times New Roman"/>
-          <w:b/>
-          <w:bCs/>
+        <w:jc w:val="both"/>
+        <w:rPr>
+          <w:rFonts w:ascii="Times New Roman" w:eastAsia="Times New Roman" w:hAnsi="Times New Roman" w:cs="Times New Roman"/>
+          <w:sz w:val="24"/>
+          <w:szCs w:val="24"/>
+          <w:lang w:eastAsia="pt-BR"/>
+        </w:rPr>
+      </w:pPr>
+      <w:r>
+        <w:rPr>
+          <w:rFonts w:ascii="Times New Roman" w:eastAsia="Times New Roman" w:hAnsi="Times New Roman" w:cs="Times New Roman"/>
+          <w:b/>
+          <w:bCs/>
+          <w:sz w:val="24"/>
+          <w:szCs w:val="24"/>
+          <w:lang w:eastAsia="pt-BR"/>
+        </w:rPr>
+        <w:t>CLÁUSULA 9ª:</w:t>
+      </w:r>
+      <w:r>
+        <w:rPr>
+          <w:rFonts w:ascii="Times New Roman" w:eastAsia="Times New Roman" w:hAnsi="Times New Roman" w:cs="Times New Roman"/>
+          <w:sz w:val="24"/>
+          <w:szCs w:val="24"/>
+          <w:lang w:eastAsia="pt-BR"/>
+        </w:rPr>
+        <w:t xml:space="preserve"> Ajustam as partes, nos termos dos arts. 317, 478 e 479 do Código Civil, e demais dispositivos legais aplicáveis à espécie, que na hipótese da ocorrência, por motivos imprevisíveis, de desproporção manifesta entre o custo do serviço estipulado no momento da contratação da prestação devida e aquele do momento de sua </w:t>
+      </w:r>
+      <w:r>
+        <w:rPr>
+          <w:rFonts w:ascii="Times New Roman" w:eastAsia="Times New Roman" w:hAnsi="Times New Roman" w:cs="Times New Roman"/>
           <w:sz w:val="24"/>
           <w:szCs w:val="24"/>
           <w:lang w:eastAsia="pt-BR"/>
         </w:rPr>
         <w:lastRenderedPageBreak/>
-        <w:t>CLÁUSULA 9ª:</w:t>
-      </w:r>
-      <w:r>
-        <w:rPr>
-          <w:rFonts w:ascii="Times New Roman" w:eastAsia="Times New Roman" w:hAnsi="Times New Roman" w:cs="Times New Roman"/>
-          <w:sz w:val="24"/>
-          <w:szCs w:val="24"/>
-          <w:lang w:eastAsia="pt-BR"/>
-        </w:rPr>
-        <w:t xml:space="preserve"> Ajustam as partes, nos termos dos arts. 317, 478 e 479 do Código Civil, e demais dispositivos legais aplicáveis à espécie, que na hipótese da ocorrência, por motivos imprevisíveis, de desproporção manifesta entre o custo do serviço estipulado no momento da contratação da prestação devida e aquele do momento de sua execução, será realizado o reequilíbrio econômico-financeiro da avença de sorte a que se adeque o custo do serviço ao seu valor real, majorando-o.</w:t>
+        <w:t>execução, será realizado o reequilíbrio econômico-financeiro da avença de sorte a que se adeque o custo do serviço ao seu valor real, majorando-o.</w:t>
       </w:r>
     </w:p>
     <w:p>
@@ -1446,6 +1665,7 @@
     <w:p>
       <w:pPr>
         <w:spacing w:before="100" w:beforeAutospacing="1" w:after="100" w:afterAutospacing="1" w:line="240" w:lineRule="auto"/>
+        <w:jc w:val="both"/>
         <w:rPr>
           <w:rFonts w:ascii="Times New Roman" w:eastAsia="Times New Roman" w:hAnsi="Times New Roman" w:cs="Times New Roman"/>
           <w:sz w:val="24"/>
@@ -1499,6 +1719,7 @@
     <w:p>
       <w:pPr>
         <w:spacing w:before="100" w:beforeAutospacing="1" w:after="100" w:afterAutospacing="1" w:line="240" w:lineRule="auto"/>
+        <w:jc w:val="both"/>
         <w:rPr>
           <w:rFonts w:ascii="Times New Roman" w:eastAsia="Times New Roman" w:hAnsi="Times New Roman" w:cs="Times New Roman"/>
           <w:sz w:val="24"/>
@@ -1552,6 +1773,7 @@
     <w:p>
       <w:pPr>
         <w:spacing w:before="100" w:beforeAutospacing="1" w:after="100" w:afterAutospacing="1" w:line="240" w:lineRule="auto"/>
+        <w:jc w:val="both"/>
         <w:rPr>
           <w:rFonts w:ascii="Times New Roman" w:eastAsia="Times New Roman" w:hAnsi="Times New Roman" w:cs="Times New Roman"/>
           <w:sz w:val="24"/>
@@ -1605,6 +1827,7 @@
     <w:p>
       <w:pPr>
         <w:spacing w:before="100" w:beforeAutospacing="1" w:after="100" w:afterAutospacing="1" w:line="240" w:lineRule="auto"/>
+        <w:jc w:val="both"/>
         <w:rPr>
           <w:rFonts w:ascii="Times New Roman" w:eastAsia="Times New Roman" w:hAnsi="Times New Roman" w:cs="Times New Roman"/>
           <w:sz w:val="24"/>
@@ -1636,6 +1859,7 @@
     <w:p>
       <w:pPr>
         <w:spacing w:before="100" w:beforeAutospacing="1" w:after="100" w:afterAutospacing="1" w:line="240" w:lineRule="auto"/>
+        <w:jc w:val="both"/>
         <w:rPr>
           <w:rFonts w:ascii="Times New Roman" w:eastAsia="Times New Roman" w:hAnsi="Times New Roman" w:cs="Times New Roman"/>
           <w:sz w:val="24"/>
@@ -1680,6 +1904,7 @@
           <w:rFonts w:ascii="Times New Roman" w:eastAsia="Times New Roman" w:hAnsi="Times New Roman" w:cs="Times New Roman"/>
           <w:sz w:val="24"/>
           <w:szCs w:val="24"/>
+          <w:highlight w:val="yellow"/>
           <w:lang w:eastAsia="pt-BR"/>
         </w:rPr>
         <w:t>{{cidadeClinica}}, {{date}}</w:t>
@@ -1827,7 +2052,6 @@
           <w:szCs w:val="24"/>
           <w:lang w:eastAsia="pt-BR"/>
         </w:rPr>
-        <w:lastRenderedPageBreak/>
         <w:t>CONTRATADO</w:t>
       </w:r>
     </w:p>
@@ -1854,8 +2078,9 @@
     </w:p>
     <w:p/>
     <w:sectPr>
+      <w:footerReference w:type="default" r:id="rId7"/>
       <w:pgSz w:w="11906" w:h="16838"/>
-      <w:pgMar w:top="1417" w:right="1701" w:bottom="1417" w:left="1701" w:header="708" w:footer="708" w:gutter="0"/>
+      <w:pgMar w:top="851" w:right="1701" w:bottom="1417" w:left="1701" w:header="708" w:footer="708" w:gutter="0"/>
       <w:cols w:space="708"/>
       <w:docGrid w:linePitch="360"/>
     </w:sectPr>
@@ -1863,9 +2088,94 @@
 </w:document>
 </file>
 
+<file path=word/endnotes.xml><?xml version="1.0" encoding="utf-8"?>
+<w:endnotes xmlns:ve="http://schemas.openxmlformats.org/markup-compatibility/2006" xmlns:o="urn:schemas-microsoft-com:office:office" xmlns:r="http://schemas.openxmlformats.org/officeDocument/2006/relationships" xmlns:m="http://schemas.openxmlformats.org/officeDocument/2006/math" xmlns:v="urn:schemas-microsoft-com:vml" xmlns:wp="http://schemas.openxmlformats.org/drawingml/2006/wordprocessingDrawing" xmlns:w10="urn:schemas-microsoft-com:office:word" xmlns:w="http://schemas.openxmlformats.org/wordprocessingml/2006/main" xmlns:wne="http://schemas.microsoft.com/office/word/2006/wordml">
+  <w:endnote w:type="separator" w:id="0">
+    <w:p>
+      <w:pPr>
+        <w:spacing w:after="0" w:line="240" w:lineRule="auto"/>
+      </w:pPr>
+      <w:r>
+        <w:separator/>
+      </w:r>
+    </w:p>
+  </w:endnote>
+  <w:endnote w:type="continuationSeparator" w:id="1">
+    <w:p>
+      <w:pPr>
+        <w:spacing w:after="0" w:line="240" w:lineRule="auto"/>
+      </w:pPr>
+      <w:r>
+        <w:continuationSeparator/>
+      </w:r>
+    </w:p>
+  </w:endnote>
+</w:endnotes>
+</file>
+
+<file path=word/footer1.xml><?xml version="1.0" encoding="utf-8"?>
+<w:ftr xmlns:ve="http://schemas.openxmlformats.org/markup-compatibility/2006" xmlns:o="urn:schemas-microsoft-com:office:office" xmlns:r="http://schemas.openxmlformats.org/officeDocument/2006/relationships" xmlns:m="http://schemas.openxmlformats.org/officeDocument/2006/math" xmlns:v="urn:schemas-microsoft-com:vml" xmlns:wp="http://schemas.openxmlformats.org/drawingml/2006/wordprocessingDrawing" xmlns:w10="urn:schemas-microsoft-com:office:word" xmlns:w="http://schemas.openxmlformats.org/wordprocessingml/2006/main" xmlns:wne="http://schemas.microsoft.com/office/word/2006/wordml">
+  <w:sdt>
+    <w:sdtPr>
+      <w:id w:val="128195755"/>
+      <w:docPartObj>
+        <w:docPartGallery w:val="Page Numbers (Bottom of Page)"/>
+        <w:docPartUnique/>
+      </w:docPartObj>
+    </w:sdtPr>
+    <w:sdtContent>
+      <w:p>
+        <w:pPr>
+          <w:pStyle w:val="Rodap"/>
+          <w:jc w:val="right"/>
+        </w:pPr>
+        <w:fldSimple w:instr=" PAGE   \* MERGEFORMAT ">
+          <w:r>
+            <w:rPr>
+              <w:noProof/>
+            </w:rPr>
+            <w:t>5</w:t>
+          </w:r>
+        </w:fldSimple>
+      </w:p>
+    </w:sdtContent>
+  </w:sdt>
+  <w:p>
+    <w:pPr>
+      <w:pStyle w:val="Rodap"/>
+    </w:pPr>
+  </w:p>
+</w:ftr>
+</file>
+
+<file path=word/footnotes.xml><?xml version="1.0" encoding="utf-8"?>
+<w:footnotes xmlns:ve="http://schemas.openxmlformats.org/markup-compatibility/2006" xmlns:o="urn:schemas-microsoft-com:office:office" xmlns:r="http://schemas.openxmlformats.org/officeDocument/2006/relationships" xmlns:m="http://schemas.openxmlformats.org/officeDocument/2006/math" xmlns:v="urn:schemas-microsoft-com:vml" xmlns:wp="http://schemas.openxmlformats.org/drawingml/2006/wordprocessingDrawing" xmlns:w10="urn:schemas-microsoft-com:office:word" xmlns:w="http://schemas.openxmlformats.org/wordprocessingml/2006/main" xmlns:wne="http://schemas.microsoft.com/office/word/2006/wordml">
+  <w:footnote w:type="separator" w:id="0">
+    <w:p>
+      <w:pPr>
+        <w:spacing w:after="0" w:line="240" w:lineRule="auto"/>
+      </w:pPr>
+      <w:r>
+        <w:separator/>
+      </w:r>
+    </w:p>
+  </w:footnote>
+  <w:footnote w:type="continuationSeparator" w:id="1">
+    <w:p>
+      <w:pPr>
+        <w:spacing w:after="0" w:line="240" w:lineRule="auto"/>
+      </w:pPr>
+      <w:r>
+        <w:continuationSeparator/>
+      </w:r>
+    </w:p>
+  </w:footnote>
+</w:footnotes>
+</file>
+
 <file path=word/numbering.xml><?xml version="1.0" encoding="utf-8"?>
-<w:numbering xmlns:wpc="http://schemas.microsoft.com/office/word/2010/wordprocessingCanvas" xmlns:cx="http://schemas.microsoft.com/office/drawing/2014/chartex" xmlns:cx1="http://schemas.microsoft.com/office/drawing/2015/9/8/chartex" xmlns:cx2="http://schemas.microsoft.com/office/drawing/2015/10/21/chartex" xmlns:cx3="http://schemas.microsoft.com/office/drawing/2016/5/9/chartex" xmlns:cx4="http://schemas.microsoft.com/office/drawing/2016/5/10/chartex" xmlns:cx5="http://schemas.microsoft.com/office/drawing/2016/5/11/chartex" xmlns:cx6="http://schemas.microsoft.com/office/drawing/2016/5/12/chartex" xmlns:cx7="http://schemas.microsoft.com/office/drawing/2016/5/13/chartex" xmlns:cx8="http://schemas.microsoft.com/office/drawing/2016/5/14/chartex" xmlns:mc="http://schemas.openxmlformats.org/markup-compatibility/2006" xmlns:aink="http://schemas.microsoft.com/office/drawing/2016/ink" xmlns:am3d="http://schemas.microsoft.com/office/drawing/2017/model3d" xmlns:o="urn:schemas-microsoft-com:office:office" xmlns:r="http://schemas.openxmlformats.org/officeDocument/2006/relationships" xmlns:m="http://schemas.openxmlformats.org/officeDocument/2006/math" xmlns:v="urn:schemas-microsoft-com:vml" xmlns:wp14="http://schemas.microsoft.com/office/word/2010/wordprocessingDrawing" xmlns:wp="http://schemas.openxmlformats.org/drawingml/2006/wordprocessingDrawing" xmlns:w10="urn:schemas-microsoft-com:office:word" xmlns:w="http://schemas.openxmlformats.org/wordprocessingml/2006/main" xmlns:w14="http://schemas.microsoft.com/office/word/2010/wordml" xmlns:w15="http://schemas.microsoft.com/office/word/2012/wordml" xmlns:w16cex="http://schemas.microsoft.com/office/word/2018/wordml/cex" xmlns:w16cid="http://schemas.microsoft.com/office/word/2016/wordml/cid" xmlns:w16="http://schemas.microsoft.com/office/word/2018/wordml" xmlns:w16sdtdh="http://schemas.microsoft.com/office/word/2020/wordml/sdtdatahash" xmlns:w16se="http://schemas.microsoft.com/office/word/2015/wordml/symex" xmlns:wpg="http://schemas.microsoft.com/office/word/2010/wordprocessingGroup" xmlns:wpi="http://schemas.microsoft.com/office/word/2010/wordprocessingInk" xmlns:wne="http://schemas.microsoft.com/office/word/2006/wordml" xmlns:wps="http://schemas.microsoft.com/office/word/2010/wordprocessingShape" mc:Ignorable="w14 w15 w16se w16cid w16 w16cex w16sdtdh wp14">
-  <w:abstractNum w:abstractNumId="0" w15:restartNumberingAfterBreak="0">
+<w:numbering xmlns:ve="http://schemas.openxmlformats.org/markup-compatibility/2006" xmlns:o="urn:schemas-microsoft-com:office:office" xmlns:r="http://schemas.openxmlformats.org/officeDocument/2006/relationships" xmlns:m="http://schemas.openxmlformats.org/officeDocument/2006/math" xmlns:v="urn:schemas-microsoft-com:vml" xmlns:wp="http://schemas.openxmlformats.org/drawingml/2006/wordprocessingDrawing" xmlns:w10="urn:schemas-microsoft-com:office:word" xmlns:w="http://schemas.openxmlformats.org/wordprocessingml/2006/main" xmlns:wne="http://schemas.microsoft.com/office/word/2006/wordml">
+  <w:abstractNum w:abstractNumId="0">
     <w:nsid w:val="308A4B63"/>
     <w:multiLevelType w:val="multilevel"/>
     <w:tmpl w:val="B12423A4"/>
@@ -1978,7 +2288,7 @@
       </w:pPr>
     </w:lvl>
   </w:abstractNum>
-  <w:abstractNum w:abstractNumId="1" w15:restartNumberingAfterBreak="0">
+  <w:abstractNum w:abstractNumId="1">
     <w:nsid w:val="499D6165"/>
     <w:multiLevelType w:val="multilevel"/>
     <w:tmpl w:val="66C290B2"/>
@@ -2101,7 +2411,7 @@
 </file>
 
 <file path=word/styles.xml><?xml version="1.0" encoding="utf-8"?>
-<w:styles xmlns:mc="http://schemas.openxmlformats.org/markup-compatibility/2006" xmlns:r="http://schemas.openxmlformats.org/officeDocument/2006/relationships" xmlns:w="http://schemas.openxmlformats.org/wordprocessingml/2006/main" xmlns:w14="http://schemas.microsoft.com/office/word/2010/wordml" xmlns:w15="http://schemas.microsoft.com/office/word/2012/wordml" xmlns:w16cex="http://schemas.microsoft.com/office/word/2018/wordml/cex" xmlns:w16cid="http://schemas.microsoft.com/office/word/2016/wordml/cid" xmlns:w16="http://schemas.microsoft.com/office/word/2018/wordml" xmlns:w16sdtdh="http://schemas.microsoft.com/office/word/2020/wordml/sdtdatahash" xmlns:w16se="http://schemas.microsoft.com/office/word/2015/wordml/symex" mc:Ignorable="w14 w15 w16se w16cid w16 w16cex w16sdtdh">
+<w:styles xmlns:r="http://schemas.openxmlformats.org/officeDocument/2006/relationships" xmlns:w="http://schemas.openxmlformats.org/wordprocessingml/2006/main">
   <w:docDefaults>
     <w:rPrDefault>
       <w:rPr>
@@ -2117,392 +2427,154 @@
       </w:pPr>
     </w:pPrDefault>
   </w:docDefaults>
-  <w:latentStyles w:defLockedState="0" w:defUIPriority="99" w:defSemiHidden="0" w:defUnhideWhenUsed="0" w:defQFormat="0" w:count="376">
-    <w:lsdException w:name="Normal" w:uiPriority="0" w:qFormat="1"/>
-    <w:lsdException w:name="heading 1" w:uiPriority="9" w:qFormat="1"/>
-    <w:lsdException w:name="heading 2" w:semiHidden="1" w:uiPriority="9" w:unhideWhenUsed="1" w:qFormat="1"/>
-    <w:lsdException w:name="heading 3" w:semiHidden="1" w:uiPriority="9" w:unhideWhenUsed="1" w:qFormat="1"/>
-    <w:lsdException w:name="heading 4" w:semiHidden="1" w:uiPriority="9" w:unhideWhenUsed="1" w:qFormat="1"/>
-    <w:lsdException w:name="heading 5" w:semiHidden="1" w:uiPriority="9" w:unhideWhenUsed="1" w:qFormat="1"/>
-    <w:lsdException w:name="heading 6" w:semiHidden="1" w:uiPriority="9" w:unhideWhenUsed="1" w:qFormat="1"/>
-    <w:lsdException w:name="heading 7" w:semiHidden="1" w:uiPriority="9" w:unhideWhenUsed="1" w:qFormat="1"/>
-    <w:lsdException w:name="heading 8" w:semiHidden="1" w:uiPriority="9" w:unhideWhenUsed="1" w:qFormat="1"/>
-    <w:lsdException w:name="heading 9" w:semiHidden="1" w:uiPriority="9" w:unhideWhenUsed="1" w:qFormat="1"/>
-    <w:lsdException w:name="index 1" w:semiHidden="1" w:unhideWhenUsed="1"/>
-    <w:lsdException w:name="index 2" w:semiHidden="1" w:unhideWhenUsed="1"/>
-    <w:lsdException w:name="index 3" w:semiHidden="1" w:unhideWhenUsed="1"/>
-    <w:lsdException w:name="index 4" w:semiHidden="1" w:unhideWhenUsed="1"/>
-    <w:lsdException w:name="index 5" w:semiHidden="1" w:unhideWhenUsed="1"/>
-    <w:lsdException w:name="index 6" w:semiHidden="1" w:unhideWhenUsed="1"/>
-    <w:lsdException w:name="index 7" w:semiHidden="1" w:unhideWhenUsed="1"/>
-    <w:lsdException w:name="index 8" w:semiHidden="1" w:unhideWhenUsed="1"/>
-    <w:lsdException w:name="index 9" w:semiHidden="1" w:unhideWhenUsed="1"/>
-    <w:lsdException w:name="toc 1" w:semiHidden="1" w:uiPriority="39" w:unhideWhenUsed="1"/>
-    <w:lsdException w:name="toc 2" w:semiHidden="1" w:uiPriority="39" w:unhideWhenUsed="1"/>
-    <w:lsdException w:name="toc 3" w:semiHidden="1" w:uiPriority="39" w:unhideWhenUsed="1"/>
-    <w:lsdException w:name="toc 4" w:semiHidden="1" w:uiPriority="39" w:unhideWhenUsed="1"/>
-    <w:lsdException w:name="toc 5" w:semiHidden="1" w:uiPriority="39" w:unhideWhenUsed="1"/>
-    <w:lsdException w:name="toc 6" w:semiHidden="1" w:uiPriority="39" w:unhideWhenUsed="1"/>
-    <w:lsdException w:name="toc 7" w:semiHidden="1" w:uiPriority="39" w:unhideWhenUsed="1"/>
-    <w:lsdException w:name="toc 8" w:semiHidden="1" w:uiPriority="39" w:unhideWhenUsed="1"/>
-    <w:lsdException w:name="toc 9" w:semiHidden="1" w:uiPriority="39" w:unhideWhenUsed="1"/>
-    <w:lsdException w:name="Normal Indent" w:semiHidden="1" w:unhideWhenUsed="1"/>
-    <w:lsdException w:name="footnote text" w:semiHidden="1" w:unhideWhenUsed="1"/>
-    <w:lsdException w:name="annotation text" w:semiHidden="1" w:unhideWhenUsed="1"/>
-    <w:lsdException w:name="header" w:semiHidden="1" w:unhideWhenUsed="1"/>
-    <w:lsdException w:name="footer" w:semiHidden="1" w:unhideWhenUsed="1"/>
-    <w:lsdException w:name="index heading" w:semiHidden="1" w:unhideWhenUsed="1"/>
-    <w:lsdException w:name="caption" w:semiHidden="1" w:uiPriority="35" w:unhideWhenUsed="1" w:qFormat="1"/>
-    <w:lsdException w:name="table of figures" w:semiHidden="1" w:unhideWhenUsed="1"/>
-    <w:lsdException w:name="envelope address" w:semiHidden="1" w:unhideWhenUsed="1"/>
-    <w:lsdException w:name="envelope return" w:semiHidden="1" w:unhideWhenUsed="1"/>
-    <w:lsdException w:name="footnote reference" w:semiHidden="1" w:unhideWhenUsed="1"/>
-    <w:lsdException w:name="annotation reference" w:semiHidden="1" w:unhideWhenUsed="1"/>
-    <w:lsdException w:name="line number" w:semiHidden="1" w:unhideWhenUsed="1"/>
-    <w:lsdException w:name="page number" w:semiHidden="1" w:unhideWhenUsed="1"/>
-    <w:lsdException w:name="endnote reference" w:semiHidden="1" w:unhideWhenUsed="1"/>
-    <w:lsdException w:name="endnote text" w:semiHidden="1" w:unhideWhenUsed="1"/>
-    <w:lsdException w:name="table of authorities" w:semiHidden="1" w:unhideWhenUsed="1"/>
-    <w:lsdException w:name="macro" w:semiHidden="1" w:unhideWhenUsed="1"/>
-    <w:lsdException w:name="toa heading" w:semiHidden="1" w:unhideWhenUsed="1"/>
-    <w:lsdException w:name="List" w:semiHidden="1" w:unhideWhenUsed="1"/>
-    <w:lsdException w:name="List Bullet" w:semiHidden="1" w:unhideWhenUsed="1"/>
-    <w:lsdException w:name="List Number" w:semiHidden="1" w:unhideWhenUsed="1"/>
-    <w:lsdException w:name="List 2" w:semiHidden="1" w:unhideWhenUsed="1"/>
-    <w:lsdException w:name="List 3" w:semiHidden="1" w:unhideWhenUsed="1"/>
-    <w:lsdException w:name="List 4" w:semiHidden="1" w:unhideWhenUsed="1"/>
-    <w:lsdException w:name="List 5" w:semiHidden="1" w:unhideWhenUsed="1"/>
-    <w:lsdException w:name="List Bullet 2" w:semiHidden="1" w:unhideWhenUsed="1"/>
-    <w:lsdException w:name="List Bullet 3" w:semiHidden="1" w:unhideWhenUsed="1"/>
-    <w:lsdException w:name="List Bullet 4" w:semiHidden="1" w:unhideWhenUsed="1"/>
-    <w:lsdException w:name="List Bullet 5" w:semiHidden="1" w:unhideWhenUsed="1"/>
-    <w:lsdException w:name="List Number 2" w:semiHidden="1" w:unhideWhenUsed="1"/>
-    <w:lsdException w:name="List Number 3" w:semiHidden="1" w:unhideWhenUsed="1"/>
-    <w:lsdException w:name="List Number 4" w:semiHidden="1" w:unhideWhenUsed="1"/>
-    <w:lsdException w:name="List Number 5" w:semiHidden="1" w:unhideWhenUsed="1"/>
-    <w:lsdException w:name="Title" w:uiPriority="10" w:qFormat="1"/>
-    <w:lsdException w:name="Closing" w:semiHidden="1" w:unhideWhenUsed="1"/>
-    <w:lsdException w:name="Signature" w:semiHidden="1" w:unhideWhenUsed="1"/>
-    <w:lsdException w:name="Default Paragraph Font" w:semiHidden="1" w:uiPriority="1" w:unhideWhenUsed="1"/>
-    <w:lsdException w:name="Body Text" w:semiHidden="1" w:unhideWhenUsed="1"/>
-    <w:lsdException w:name="Body Text Indent" w:semiHidden="1" w:unhideWhenUsed="1"/>
-    <w:lsdException w:name="List Continue" w:semiHidden="1" w:unhideWhenUsed="1"/>
-    <w:lsdException w:name="List Continue 2" w:semiHidden="1" w:unhideWhenUsed="1"/>
-    <w:lsdException w:name="List Continue 3" w:semiHidden="1" w:unhideWhenUsed="1"/>
-    <w:lsdException w:name="List Continue 4" w:semiHidden="1" w:unhideWhenUsed="1"/>
-    <w:lsdException w:name="List Continue 5" w:semiHidden="1" w:unhideWhenUsed="1"/>
-    <w:lsdException w:name="Message Header" w:semiHidden="1" w:unhideWhenUsed="1"/>
-    <w:lsdException w:name="Subtitle" w:uiPriority="11" w:qFormat="1"/>
-    <w:lsdException w:name="Salutation" w:semiHidden="1" w:unhideWhenUsed="1"/>
-    <w:lsdException w:name="Date" w:semiHidden="1" w:unhideWhenUsed="1"/>
-    <w:lsdException w:name="Body Text First Indent" w:semiHidden="1" w:unhideWhenUsed="1"/>
-    <w:lsdException w:name="Body Text First Indent 2" w:semiHidden="1" w:unhideWhenUsed="1"/>
-    <w:lsdException w:name="Note Heading" w:semiHidden="1" w:unhideWhenUsed="1"/>
-    <w:lsdException w:name="Body Text 2" w:semiHidden="1" w:unhideWhenUsed="1"/>
-    <w:lsdException w:name="Body Text 3" w:semiHidden="1" w:unhideWhenUsed="1"/>
-    <w:lsdException w:name="Body Text Indent 2" w:semiHidden="1" w:unhideWhenUsed="1"/>
-    <w:lsdException w:name="Body Text Indent 3" w:semiHidden="1" w:unhideWhenUsed="1"/>
-    <w:lsdException w:name="Block Text" w:semiHidden="1" w:unhideWhenUsed="1"/>
-    <w:lsdException w:name="Hyperlink" w:semiHidden="1" w:unhideWhenUsed="1"/>
-    <w:lsdException w:name="FollowedHyperlink" w:semiHidden="1" w:unhideWhenUsed="1"/>
-    <w:lsdException w:name="Strong" w:uiPriority="22" w:qFormat="1"/>
-    <w:lsdException w:name="Emphasis" w:uiPriority="20" w:qFormat="1"/>
-    <w:lsdException w:name="Document Map" w:semiHidden="1" w:unhideWhenUsed="1"/>
-    <w:lsdException w:name="Plain Text" w:semiHidden="1" w:unhideWhenUsed="1"/>
-    <w:lsdException w:name="E-mail Signature" w:semiHidden="1" w:unhideWhenUsed="1"/>
-    <w:lsdException w:name="HTML Top of Form" w:semiHidden="1" w:unhideWhenUsed="1"/>
-    <w:lsdException w:name="HTML Bottom of Form" w:semiHidden="1" w:unhideWhenUsed="1"/>
-    <w:lsdException w:name="Normal (Web)" w:semiHidden="1" w:unhideWhenUsed="1"/>
-    <w:lsdException w:name="HTML Acronym" w:semiHidden="1" w:unhideWhenUsed="1"/>
-    <w:lsdException w:name="HTML Address" w:semiHidden="1" w:unhideWhenUsed="1"/>
-    <w:lsdException w:name="HTML Cite" w:semiHidden="1" w:unhideWhenUsed="1"/>
-    <w:lsdException w:name="HTML Code" w:semiHidden="1" w:unhideWhenUsed="1"/>
-    <w:lsdException w:name="HTML Definition" w:semiHidden="1" w:unhideWhenUsed="1"/>
-    <w:lsdException w:name="HTML Keyboard" w:semiHidden="1" w:unhideWhenUsed="1"/>
-    <w:lsdException w:name="HTML Preformatted" w:semiHidden="1" w:unhideWhenUsed="1"/>
-    <w:lsdException w:name="HTML Sample" w:semiHidden="1" w:unhideWhenUsed="1"/>
-    <w:lsdException w:name="HTML Typewriter" w:semiHidden="1" w:unhideWhenUsed="1"/>
-    <w:lsdException w:name="HTML Variable" w:semiHidden="1" w:unhideWhenUsed="1"/>
-    <w:lsdException w:name="Normal Table" w:semiHidden="1" w:unhideWhenUsed="1"/>
-    <w:lsdException w:name="annotation subject" w:semiHidden="1" w:unhideWhenUsed="1"/>
-    <w:lsdException w:name="No List" w:semiHidden="1" w:unhideWhenUsed="1"/>
-    <w:lsdException w:name="Outline List 1" w:semiHidden="1" w:unhideWhenUsed="1"/>
-    <w:lsdException w:name="Outline List 2" w:semiHidden="1" w:unhideWhenUsed="1"/>
-    <w:lsdException w:name="Outline List 3" w:semiHidden="1" w:unhideWhenUsed="1"/>
-    <w:lsdException w:name="Table Simple 1" w:semiHidden="1" w:unhideWhenUsed="1"/>
-    <w:lsdException w:name="Table Simple 2" w:semiHidden="1" w:unhideWhenUsed="1"/>
-    <w:lsdException w:name="Table Simple 3" w:semiHidden="1" w:unhideWhenUsed="1"/>
-    <w:lsdException w:name="Table Classic 1" w:semiHidden="1" w:unhideWhenUsed="1"/>
-    <w:lsdException w:name="Table Classic 2" w:semiHidden="1" w:unhideWhenUsed="1"/>
-    <w:lsdException w:name="Table Classic 3" w:semiHidden="1" w:unhideWhenUsed="1"/>
-    <w:lsdException w:name="Table Classic 4" w:semiHidden="1" w:unhideWhenUsed="1"/>
-    <w:lsdException w:name="Table Colorful 1" w:semiHidden="1" w:unhideWhenUsed="1"/>
-    <w:lsdException w:name="Table Colorful 2" w:semiHidden="1" w:unhideWhenUsed="1"/>
-    <w:lsdException w:name="Table Colorful 3" w:semiHidden="1" w:unhideWhenUsed="1"/>
-    <w:lsdException w:name="Table Columns 1" w:semiHidden="1" w:unhideWhenUsed="1"/>
-    <w:lsdException w:name="Table Columns 2" w:semiHidden="1" w:unhideWhenUsed="1"/>
-    <w:lsdException w:name="Table Columns 3" w:semiHidden="1" w:unhideWhenUsed="1"/>
-    <w:lsdException w:name="Table Columns 4" w:semiHidden="1" w:unhideWhenUsed="1"/>
-    <w:lsdException w:name="Table Columns 5" w:semiHidden="1" w:unhideWhenUsed="1"/>
-    <w:lsdException w:name="Table Grid 1" w:semiHidden="1" w:unhideWhenUsed="1"/>
-    <w:lsdException w:name="Table Grid 2" w:semiHidden="1" w:unhideWhenUsed="1"/>
-    <w:lsdException w:name="Table Grid 3" w:semiHidden="1" w:unhideWhenUsed="1"/>
-    <w:lsdException w:name="Table Grid 4" w:semiHidden="1" w:unhideWhenUsed="1"/>
-    <w:lsdException w:name="Table Grid 5" w:semiHidden="1" w:unhideWhenUsed="1"/>
-    <w:lsdException w:name="Table Grid 6" w:semiHidden="1" w:unhideWhenUsed="1"/>
-    <w:lsdException w:name="Table Grid 7" w:semiHidden="1" w:unhideWhenUsed="1"/>
-    <w:lsdException w:name="Table Grid 8" w:semiHidden="1" w:unhideWhenUsed="1"/>
-    <w:lsdException w:name="Table List 1" w:semiHidden="1" w:unhideWhenUsed="1"/>
-    <w:lsdException w:name="Table List 2" w:semiHidden="1" w:unhideWhenUsed="1"/>
-    <w:lsdException w:name="Table List 3" w:semiHidden="1" w:unhideWhenUsed="1"/>
-    <w:lsdException w:name="Table List 4" w:semiHidden="1" w:unhideWhenUsed="1"/>
-    <w:lsdException w:name="Table List 5" w:semiHidden="1" w:unhideWhenUsed="1"/>
-    <w:lsdException w:name="Table List 6" w:semiHidden="1" w:unhideWhenUsed="1"/>
-    <w:lsdException w:name="Table List 7" w:semiHidden="1" w:unhideWhenUsed="1"/>
-    <w:lsdException w:name="Table List 8" w:semiHidden="1" w:unhideWhenUsed="1"/>
-    <w:lsdException w:name="Table 3D effects 1" w:semiHidden="1" w:unhideWhenUsed="1"/>
-    <w:lsdException w:name="Table 3D effects 2" w:semiHidden="1" w:unhideWhenUsed="1"/>
-    <w:lsdException w:name="Table 3D effects 3" w:semiHidden="1" w:unhideWhenUsed="1"/>
-    <w:lsdException w:name="Table Contemporary" w:semiHidden="1" w:unhideWhenUsed="1"/>
-    <w:lsdException w:name="Table Elegant" w:semiHidden="1" w:unhideWhenUsed="1"/>
-    <w:lsdException w:name="Table Professional" w:semiHidden="1" w:unhideWhenUsed="1"/>
-    <w:lsdException w:name="Table Subtle 1" w:semiHidden="1" w:unhideWhenUsed="1"/>
-    <w:lsdException w:name="Table Subtle 2" w:semiHidden="1" w:unhideWhenUsed="1"/>
-    <w:lsdException w:name="Table Web 1" w:semiHidden="1" w:unhideWhenUsed="1"/>
-    <w:lsdException w:name="Table Web 2" w:semiHidden="1" w:unhideWhenUsed="1"/>
-    <w:lsdException w:name="Table Web 3" w:semiHidden="1" w:unhideWhenUsed="1"/>
-    <w:lsdException w:name="Balloon Text" w:semiHidden="1" w:unhideWhenUsed="1"/>
-    <w:lsdException w:name="Table Grid" w:uiPriority="39"/>
-    <w:lsdException w:name="Table Theme" w:semiHidden="1" w:unhideWhenUsed="1"/>
-    <w:lsdException w:name="Placeholder Text" w:semiHidden="1"/>
-    <w:lsdException w:name="No Spacing" w:uiPriority="1" w:qFormat="1"/>
-    <w:lsdException w:name="Light Shading" w:uiPriority="60"/>
-    <w:lsdException w:name="Light List" w:uiPriority="61"/>
-    <w:lsdException w:name="Light Grid" w:uiPriority="62"/>
-    <w:lsdException w:name="Medium Shading 1" w:uiPriority="63"/>
-    <w:lsdException w:name="Medium Shading 2" w:uiPriority="64"/>
-    <w:lsdException w:name="Medium List 1" w:uiPriority="65"/>
-    <w:lsdException w:name="Medium List 2" w:uiPriority="66"/>
-    <w:lsdException w:name="Medium Grid 1" w:uiPriority="67"/>
-    <w:lsdException w:name="Medium Grid 2" w:uiPriority="68"/>
-    <w:lsdException w:name="Medium Grid 3" w:uiPriority="69"/>
-    <w:lsdException w:name="Dark List" w:uiPriority="70"/>
-    <w:lsdException w:name="Colorful Shading" w:uiPriority="71"/>
-    <w:lsdException w:name="Colorful List" w:uiPriority="72"/>
-    <w:lsdException w:name="Colorful Grid" w:uiPriority="73"/>
-    <w:lsdException w:name="Light Shading Accent 1" w:uiPriority="60"/>
-    <w:lsdException w:name="Light List Accent 1" w:uiPriority="61"/>
-    <w:lsdException w:name="Light Grid Accent 1" w:uiPriority="62"/>
-    <w:lsdException w:name="Medium Shading 1 Accent 1" w:uiPriority="63"/>
-    <w:lsdException w:name="Medium Shading 2 Accent 1" w:uiPriority="64"/>
-    <w:lsdException w:name="Medium List 1 Accent 1" w:uiPriority="65"/>
-    <w:lsdException w:name="Revision" w:semiHidden="1"/>
-    <w:lsdException w:name="List Paragraph" w:uiPriority="34" w:qFormat="1"/>
-    <w:lsdException w:name="Quote" w:uiPriority="29" w:qFormat="1"/>
-    <w:lsdException w:name="Intense Quote" w:uiPriority="30" w:qFormat="1"/>
-    <w:lsdException w:name="Medium List 2 Accent 1" w:uiPriority="66"/>
-    <w:lsdException w:name="Medium Grid 1 Accent 1" w:uiPriority="67"/>
-    <w:lsdException w:name="Medium Grid 2 Accent 1" w:uiPriority="68"/>
-    <w:lsdException w:name="Medium Grid 3 Accent 1" w:uiPriority="69"/>
-    <w:lsdException w:name="Dark List Accent 1" w:uiPriority="70"/>
-    <w:lsdException w:name="Colorful Shading Accent 1" w:uiPriority="71"/>
-    <w:lsdException w:name="Colorful List Accent 1" w:uiPriority="72"/>
-    <w:lsdException w:name="Colorful Grid Accent 1" w:uiPriority="73"/>
-    <w:lsdException w:name="Light Shading Accent 2" w:uiPriority="60"/>
-    <w:lsdException w:name="Light List Accent 2" w:uiPriority="61"/>
-    <w:lsdException w:name="Light Grid Accent 2" w:uiPriority="62"/>
-    <w:lsdException w:name="Medium Shading 1 Accent 2" w:uiPriority="63"/>
-    <w:lsdException w:name="Medium Shading 2 Accent 2" w:uiPriority="64"/>
-    <w:lsdException w:name="Medium List 1 Accent 2" w:uiPriority="65"/>
-    <w:lsdException w:name="Medium List 2 Accent 2" w:uiPriority="66"/>
-    <w:lsdException w:name="Medium Grid 1 Accent 2" w:uiPriority="67"/>
-    <w:lsdException w:name="Medium Grid 2 Accent 2" w:uiPriority="68"/>
-    <w:lsdException w:name="Medium Grid 3 Accent 2" w:uiPriority="69"/>
-    <w:lsdException w:name="Dark List Accent 2" w:uiPriority="70"/>
-    <w:lsdException w:name="Colorful Shading Accent 2" w:uiPriority="71"/>
-    <w:lsdException w:name="Colorful List Accent 2" w:uiPriority="72"/>
-    <w:lsdException w:name="Colorful Grid Accent 2" w:uiPriority="73"/>
-    <w:lsdException w:name="Light Shading Accent 3" w:uiPriority="60"/>
-    <w:lsdException w:name="Light List Accent 3" w:uiPriority="61"/>
-    <w:lsdException w:name="Light Grid Accent 3" w:uiPriority="62"/>
-    <w:lsdException w:name="Medium Shading 1 Accent 3" w:uiPriority="63"/>
-    <w:lsdException w:name="Medium Shading 2 Accent 3" w:uiPriority="64"/>
-    <w:lsdException w:name="Medium List 1 Accent 3" w:uiPriority="65"/>
-    <w:lsdException w:name="Medium List 2 Accent 3" w:uiPriority="66"/>
-    <w:lsdException w:name="Medium Grid 1 Accent 3" w:uiPriority="67"/>
-    <w:lsdException w:name="Medium Grid 2 Accent 3" w:uiPriority="68"/>
-    <w:lsdException w:name="Medium Grid 3 Accent 3" w:uiPriority="69"/>
-    <w:lsdException w:name="Dark List Accent 3" w:uiPriority="70"/>
-    <w:lsdException w:name="Colorful Shading Accent 3" w:uiPriority="71"/>
-    <w:lsdException w:name="Colorful List Accent 3" w:uiPriority="72"/>
-    <w:lsdException w:name="Colorful Grid Accent 3" w:uiPriority="73"/>
-    <w:lsdException w:name="Light Shading Accent 4" w:uiPriority="60"/>
-    <w:lsdException w:name="Light List Accent 4" w:uiPriority="61"/>
-    <w:lsdException w:name="Light Grid Accent 4" w:uiPriority="62"/>
-    <w:lsdException w:name="Medium Shading 1 Accent 4" w:uiPriority="63"/>
-    <w:lsdException w:name="Medium Shading 2 Accent 4" w:uiPriority="64"/>
-    <w:lsdException w:name="Medium List 1 Accent 4" w:uiPriority="65"/>
-    <w:lsdException w:name="Medium List 2 Accent 4" w:uiPriority="66"/>
-    <w:lsdException w:name="Medium Grid 1 Accent 4" w:uiPriority="67"/>
-    <w:lsdException w:name="Medium Grid 2 Accent 4" w:uiPriority="68"/>
-    <w:lsdException w:name="Medium Grid 3 Accent 4" w:uiPriority="69"/>
-    <w:lsdException w:name="Dark List Accent 4" w:uiPriority="70"/>
-    <w:lsdException w:name="Colorful Shading Accent 4" w:uiPriority="71"/>
-    <w:lsdException w:name="Colorful List Accent 4" w:uiPriority="72"/>
-    <w:lsdException w:name="Colorful Grid Accent 4" w:uiPriority="73"/>
-    <w:lsdException w:name="Light Shading Accent 5" w:uiPriority="60"/>
-    <w:lsdException w:name="Light List Accent 5" w:uiPriority="61"/>
-    <w:lsdException w:name="Light Grid Accent 5" w:uiPriority="62"/>
-    <w:lsdException w:name="Medium Shading 1 Accent 5" w:uiPriority="63"/>
-    <w:lsdException w:name="Medium Shading 2 Accent 5" w:uiPriority="64"/>
-    <w:lsdException w:name="Medium List 1 Accent 5" w:uiPriority="65"/>
-    <w:lsdException w:name="Medium List 2 Accent 5" w:uiPriority="66"/>
-    <w:lsdException w:name="Medium Grid 1 Accent 5" w:uiPriority="67"/>
-    <w:lsdException w:name="Medium Grid 2 Accent 5" w:uiPriority="68"/>
-    <w:lsdException w:name="Medium Grid 3 Accent 5" w:uiPriority="69"/>
-    <w:lsdException w:name="Dark List Accent 5" w:uiPriority="70"/>
-    <w:lsdException w:name="Colorful Shading Accent 5" w:uiPriority="71"/>
-    <w:lsdException w:name="Colorful List Accent 5" w:uiPriority="72"/>
-    <w:lsdException w:name="Colorful Grid Accent 5" w:uiPriority="73"/>
-    <w:lsdException w:name="Light Shading Accent 6" w:uiPriority="60"/>
-    <w:lsdException w:name="Light List Accent 6" w:uiPriority="61"/>
-    <w:lsdException w:name="Light Grid Accent 6" w:uiPriority="62"/>
-    <w:lsdException w:name="Medium Shading 1 Accent 6" w:uiPriority="63"/>
-    <w:lsdException w:name="Medium Shading 2 Accent 6" w:uiPriority="64"/>
-    <w:lsdException w:name="Medium List 1 Accent 6" w:uiPriority="65"/>
-    <w:lsdException w:name="Medium List 2 Accent 6" w:uiPriority="66"/>
-    <w:lsdException w:name="Medium Grid 1 Accent 6" w:uiPriority="67"/>
-    <w:lsdException w:name="Medium Grid 2 Accent 6" w:uiPriority="68"/>
-    <w:lsdException w:name="Medium Grid 3 Accent 6" w:uiPriority="69"/>
-    <w:lsdException w:name="Dark List Accent 6" w:uiPriority="70"/>
-    <w:lsdException w:name="Colorful Shading Accent 6" w:uiPriority="71"/>
-    <w:lsdException w:name="Colorful List Accent 6" w:uiPriority="72"/>
-    <w:lsdException w:name="Colorful Grid Accent 6" w:uiPriority="73"/>
-    <w:lsdException w:name="Subtle Emphasis" w:uiPriority="19" w:qFormat="1"/>
-    <w:lsdException w:name="Intense Emphasis" w:uiPriority="21" w:qFormat="1"/>
-    <w:lsdException w:name="Subtle Reference" w:uiPriority="31" w:qFormat="1"/>
-    <w:lsdException w:name="Intense Reference" w:uiPriority="32" w:qFormat="1"/>
-    <w:lsdException w:name="Book Title" w:uiPriority="33" w:qFormat="1"/>
-    <w:lsdException w:name="Bibliography" w:semiHidden="1" w:uiPriority="37" w:unhideWhenUsed="1"/>
-    <w:lsdException w:name="TOC Heading" w:semiHidden="1" w:uiPriority="39" w:unhideWhenUsed="1" w:qFormat="1"/>
-    <w:lsdException w:name="Plain Table 1" w:uiPriority="41"/>
-    <w:lsdException w:name="Plain Table 2" w:uiPriority="42"/>
-    <w:lsdException w:name="Plain Table 3" w:uiPriority="43"/>
-    <w:lsdException w:name="Plain Table 4" w:uiPriority="44"/>
-    <w:lsdException w:name="Plain Table 5" w:uiPriority="45"/>
-    <w:lsdException w:name="Grid Table Light" w:uiPriority="40"/>
-    <w:lsdException w:name="Grid Table 1 Light" w:uiPriority="46"/>
-    <w:lsdException w:name="Grid Table 2" w:uiPriority="47"/>
-    <w:lsdException w:name="Grid Table 3" w:uiPriority="48"/>
-    <w:lsdException w:name="Grid Table 4" w:uiPriority="49"/>
-    <w:lsdException w:name="Grid Table 5 Dark" w:uiPriority="50"/>
-    <w:lsdException w:name="Grid Table 6 Colorful" w:uiPriority="51"/>
-    <w:lsdException w:name="Grid Table 7 Colorful" w:uiPriority="52"/>
-    <w:lsdException w:name="Grid Table 1 Light Accent 1" w:uiPriority="46"/>
-    <w:lsdException w:name="Grid Table 2 Accent 1" w:uiPriority="47"/>
-    <w:lsdException w:name="Grid Table 3 Accent 1" w:uiPriority="48"/>
-    <w:lsdException w:name="Grid Table 4 Accent 1" w:uiPriority="49"/>
-    <w:lsdException w:name="Grid Table 5 Dark Accent 1" w:uiPriority="50"/>
-    <w:lsdException w:name="Grid Table 6 Colorful Accent 1" w:uiPriority="51"/>
-    <w:lsdException w:name="Grid Table 7 Colorful Accent 1" w:uiPriority="52"/>
-    <w:lsdException w:name="Grid Table 1 Light Accent 2" w:uiPriority="46"/>
-    <w:lsdException w:name="Grid Table 2 Accent 2" w:uiPriority="47"/>
-    <w:lsdException w:name="Grid Table 3 Accent 2" w:uiPriority="48"/>
-    <w:lsdException w:name="Grid Table 4 Accent 2" w:uiPriority="49"/>
-    <w:lsdException w:name="Grid Table 5 Dark Accent 2" w:uiPriority="50"/>
-    <w:lsdException w:name="Grid Table 6 Colorful Accent 2" w:uiPriority="51"/>
-    <w:lsdException w:name="Grid Table 7 Colorful Accent 2" w:uiPriority="52"/>
-    <w:lsdException w:name="Grid Table 1 Light Accent 3" w:uiPriority="46"/>
-    <w:lsdException w:name="Grid Table 2 Accent 3" w:uiPriority="47"/>
-    <w:lsdException w:name="Grid Table 3 Accent 3" w:uiPriority="48"/>
-    <w:lsdException w:name="Grid Table 4 Accent 3" w:uiPriority="49"/>
-    <w:lsdException w:name="Grid Table 5 Dark Accent 3" w:uiPriority="50"/>
-    <w:lsdException w:name="Grid Table 6 Colorful Accent 3" w:uiPriority="51"/>
-    <w:lsdException w:name="Grid Table 7 Colorful Accent 3" w:uiPriority="52"/>
-    <w:lsdException w:name="Grid Table 1 Light Accent 4" w:uiPriority="46"/>
-    <w:lsdException w:name="Grid Table 2 Accent 4" w:uiPriority="47"/>
-    <w:lsdException w:name="Grid Table 3 Accent 4" w:uiPriority="48"/>
-    <w:lsdException w:name="Grid Table 4 Accent 4" w:uiPriority="49"/>
-    <w:lsdException w:name="Grid Table 5 Dark Accent 4" w:uiPriority="50"/>
-    <w:lsdException w:name="Grid Table 6 Colorful Accent 4" w:uiPriority="51"/>
-    <w:lsdException w:name="Grid Table 7 Colorful Accent 4" w:uiPriority="52"/>
-    <w:lsdException w:name="Grid Table 1 Light Accent 5" w:uiPriority="46"/>
-    <w:lsdException w:name="Grid Table 2 Accent 5" w:uiPriority="47"/>
-    <w:lsdException w:name="Grid Table 3 Accent 5" w:uiPriority="48"/>
-    <w:lsdException w:name="Grid Table 4 Accent 5" w:uiPriority="49"/>
-    <w:lsdException w:name="Grid Table 5 Dark Accent 5" w:uiPriority="50"/>
-    <w:lsdException w:name="Grid Table 6 Colorful Accent 5" w:uiPriority="51"/>
-    <w:lsdException w:name="Grid Table 7 Colorful Accent 5" w:uiPriority="52"/>
-    <w:lsdException w:name="Grid Table 1 Light Accent 6" w:uiPriority="46"/>
-    <w:lsdException w:name="Grid Table 2 Accent 6" w:uiPriority="47"/>
-    <w:lsdException w:name="Grid Table 3 Accent 6" w:uiPriority="48"/>
-    <w:lsdException w:name="Grid Table 4 Accent 6" w:uiPriority="49"/>
-    <w:lsdException w:name="Grid Table 5 Dark Accent 6" w:uiPriority="50"/>
-    <w:lsdException w:name="Grid Table 6 Colorful Accent 6" w:uiPriority="51"/>
-    <w:lsdException w:name="Grid Table 7 Colorful Accent 6" w:uiPriority="52"/>
-    <w:lsdException w:name="List Table 1 Light" w:uiPriority="46"/>
-    <w:lsdException w:name="List Table 2" w:uiPriority="47"/>
-    <w:lsdException w:name="List Table 3" w:uiPriority="48"/>
-    <w:lsdException w:name="List Table 4" w:uiPriority="49"/>
-    <w:lsdException w:name="List Table 5 Dark" w:uiPriority="50"/>
-    <w:lsdException w:name="List Table 6 Colorful" w:uiPriority="51"/>
-    <w:lsdException w:name="List Table 7 Colorful" w:uiPriority="52"/>
-    <w:lsdException w:name="List Table 1 Light Accent 1" w:uiPriority="46"/>
-    <w:lsdException w:name="List Table 2 Accent 1" w:uiPriority="47"/>
-    <w:lsdException w:name="List Table 3 Accent 1" w:uiPriority="48"/>
-    <w:lsdException w:name="List Table 4 Accent 1" w:uiPriority="49"/>
-    <w:lsdException w:name="List Table 5 Dark Accent 1" w:uiPriority="50"/>
-    <w:lsdException w:name="List Table 6 Colorful Accent 1" w:uiPriority="51"/>
-    <w:lsdException w:name="List Table 7 Colorful Accent 1" w:uiPriority="52"/>
-    <w:lsdException w:name="List Table 1 Light Accent 2" w:uiPriority="46"/>
-    <w:lsdException w:name="List Table 2 Accent 2" w:uiPriority="47"/>
-    <w:lsdException w:name="List Table 3 Accent 2" w:uiPriority="48"/>
-    <w:lsdException w:name="List Table 4 Accent 2" w:uiPriority="49"/>
-    <w:lsdException w:name="List Table 5 Dark Accent 2" w:uiPriority="50"/>
-    <w:lsdException w:name="List Table 6 Colorful Accent 2" w:uiPriority="51"/>
-    <w:lsdException w:name="List Table 7 Colorful Accent 2" w:uiPriority="52"/>
-    <w:lsdException w:name="List Table 1 Light Accent 3" w:uiPriority="46"/>
-    <w:lsdException w:name="List Table 2 Accent 3" w:uiPriority="47"/>
-    <w:lsdException w:name="List Table 3 Accent 3" w:uiPriority="48"/>
-    <w:lsdException w:name="List Table 4 Accent 3" w:uiPriority="49"/>
-    <w:lsdException w:name="List Table 5 Dark Accent 3" w:uiPriority="50"/>
-    <w:lsdException w:name="List Table 6 Colorful Accent 3" w:uiPriority="51"/>
-    <w:lsdException w:name="List Table 7 Colorful Accent 3" w:uiPriority="52"/>
-    <w:lsdException w:name="List Table 1 Light Accent 4" w:uiPriority="46"/>
-    <w:lsdException w:name="List Table 2 Accent 4" w:uiPriority="47"/>
-    <w:lsdException w:name="List Table 3 Accent 4" w:uiPriority="48"/>
-    <w:lsdException w:name="List Table 4 Accent 4" w:uiPriority="49"/>
-    <w:lsdException w:name="List Table 5 Dark Accent 4" w:uiPriority="50"/>
-    <w:lsdException w:name="List Table 6 Colorful Accent 4" w:uiPriority="51"/>
-    <w:lsdException w:name="List Table 7 Colorful Accent 4" w:uiPriority="52"/>
-    <w:lsdException w:name="List Table 1 Light Accent 5" w:uiPriority="46"/>
-    <w:lsdException w:name="List Table 2 Accent 5" w:uiPriority="47"/>
-    <w:lsdException w:name="List Table 3 Accent 5" w:uiPriority="48"/>
-    <w:lsdException w:name="List Table 4 Accent 5" w:uiPriority="49"/>
-    <w:lsdException w:name="List Table 5 Dark Accent 5" w:uiPriority="50"/>
-    <w:lsdException w:name="List Table 6 Colorful Accent 5" w:uiPriority="51"/>
-    <w:lsdException w:name="List Table 7 Colorful Accent 5" w:uiPriority="52"/>
-    <w:lsdException w:name="List Table 1 Light Accent 6" w:uiPriority="46"/>
-    <w:lsdException w:name="List Table 2 Accent 6" w:uiPriority="47"/>
-    <w:lsdException w:name="List Table 3 Accent 6" w:uiPriority="48"/>
-    <w:lsdException w:name="List Table 4 Accent 6" w:uiPriority="49"/>
-    <w:lsdException w:name="List Table 5 Dark Accent 6" w:uiPriority="50"/>
-    <w:lsdException w:name="List Table 6 Colorful Accent 6" w:uiPriority="51"/>
-    <w:lsdException w:name="List Table 7 Colorful Accent 6" w:uiPriority="52"/>
-    <w:lsdException w:name="Mention" w:semiHidden="1" w:unhideWhenUsed="1"/>
-    <w:lsdException w:name="Smart Hyperlink" w:semiHidden="1" w:unhideWhenUsed="1"/>
-    <w:lsdException w:name="Hashtag" w:semiHidden="1" w:unhideWhenUsed="1"/>
-    <w:lsdException w:name="Unresolved Mention" w:semiHidden="1" w:unhideWhenUsed="1"/>
-    <w:lsdException w:name="Smart Link" w:semiHidden="1" w:unhideWhenUsed="1"/>
+  <w:latentStyles w:defLockedState="0" w:defUIPriority="99" w:defSemiHidden="1" w:defUnhideWhenUsed="1" w:defQFormat="0" w:count="267">
+    <w:lsdException w:name="Normal" w:semiHidden="0" w:uiPriority="0" w:unhideWhenUsed="0" w:qFormat="1"/>
+    <w:lsdException w:name="heading 1" w:semiHidden="0" w:uiPriority="9" w:unhideWhenUsed="0" w:qFormat="1"/>
+    <w:lsdException w:name="heading 2" w:uiPriority="9" w:qFormat="1"/>
+    <w:lsdException w:name="heading 3" w:uiPriority="9" w:qFormat="1"/>
+    <w:lsdException w:name="heading 4" w:uiPriority="9" w:qFormat="1"/>
+    <w:lsdException w:name="heading 5" w:uiPriority="9" w:qFormat="1"/>
+    <w:lsdException w:name="heading 6" w:uiPriority="9" w:qFormat="1"/>
+    <w:lsdException w:name="heading 7" w:uiPriority="9" w:qFormat="1"/>
+    <w:lsdException w:name="heading 8" w:uiPriority="9" w:qFormat="1"/>
+    <w:lsdException w:name="heading 9" w:uiPriority="9" w:qFormat="1"/>
+    <w:lsdException w:name="toc 1" w:uiPriority="39"/>
+    <w:lsdException w:name="toc 2" w:uiPriority="39"/>
+    <w:lsdException w:name="toc 3" w:uiPriority="39"/>
+    <w:lsdException w:name="toc 4" w:uiPriority="39"/>
+    <w:lsdException w:name="toc 5" w:uiPriority="39"/>
+    <w:lsdException w:name="toc 6" w:uiPriority="39"/>
+    <w:lsdException w:name="toc 7" w:uiPriority="39"/>
+    <w:lsdException w:name="toc 8" w:uiPriority="39"/>
+    <w:lsdException w:name="toc 9" w:uiPriority="39"/>
+    <w:lsdException w:name="caption" w:uiPriority="35" w:qFormat="1"/>
+    <w:lsdException w:name="Title" w:semiHidden="0" w:uiPriority="10" w:unhideWhenUsed="0" w:qFormat="1"/>
+    <w:lsdException w:name="Default Paragraph Font" w:uiPriority="1"/>
+    <w:lsdException w:name="Subtitle" w:semiHidden="0" w:uiPriority="11" w:unhideWhenUsed="0" w:qFormat="1"/>
+    <w:lsdException w:name="Strong" w:semiHidden="0" w:uiPriority="22" w:unhideWhenUsed="0" w:qFormat="1"/>
+    <w:lsdException w:name="Emphasis" w:semiHidden="0" w:uiPriority="20" w:unhideWhenUsed="0" w:qFormat="1"/>
+    <w:lsdException w:name="Table Grid" w:semiHidden="0" w:uiPriority="39" w:unhideWhenUsed="0"/>
+    <w:lsdException w:name="Placeholder Text" w:unhideWhenUsed="0"/>
+    <w:lsdException w:name="No Spacing" w:semiHidden="0" w:uiPriority="1" w:unhideWhenUsed="0" w:qFormat="1"/>
+    <w:lsdException w:name="Light Shading" w:semiHidden="0" w:uiPriority="60" w:unhideWhenUsed="0"/>
+    <w:lsdException w:name="Light List" w:semiHidden="0" w:uiPriority="61" w:unhideWhenUsed="0"/>
+    <w:lsdException w:name="Light Grid" w:semiHidden="0" w:uiPriority="62" w:unhideWhenUsed="0"/>
+    <w:lsdException w:name="Medium Shading 1" w:semiHidden="0" w:uiPriority="63" w:unhideWhenUsed="0"/>
+    <w:lsdException w:name="Medium Shading 2" w:semiHidden="0" w:uiPriority="64" w:unhideWhenUsed="0"/>
+    <w:lsdException w:name="Medium List 1" w:semiHidden="0" w:uiPriority="65" w:unhideWhenUsed="0"/>
+    <w:lsdException w:name="Medium List 2" w:semiHidden="0" w:uiPriority="66" w:unhideWhenUsed="0"/>
+    <w:lsdException w:name="Medium Grid 1" w:semiHidden="0" w:uiPriority="67" w:unhideWhenUsed="0"/>
+    <w:lsdException w:name="Medium Grid 2" w:semiHidden="0" w:uiPriority="68" w:unhideWhenUsed="0"/>
+    <w:lsdException w:name="Medium Grid 3" w:semiHidden="0" w:uiPriority="69" w:unhideWhenUsed="0"/>
+    <w:lsdException w:name="Dark List" w:semiHidden="0" w:uiPriority="70" w:unhideWhenUsed="0"/>
+    <w:lsdException w:name="Colorful Shading" w:semiHidden="0" w:uiPriority="71" w:unhideWhenUsed="0"/>
+    <w:lsdException w:name="Colorful List" w:semiHidden="0" w:uiPriority="72" w:unhideWhenUsed="0"/>
+    <w:lsdException w:name="Colorful Grid" w:semiHidden="0" w:uiPriority="73" w:unhideWhenUsed="0"/>
+    <w:lsdException w:name="Light Shading Accent 1" w:semiHidden="0" w:uiPriority="60" w:unhideWhenUsed="0"/>
+    <w:lsdException w:name="Light List Accent 1" w:semiHidden="0" w:uiPriority="61" w:unhideWhenUsed="0"/>
+    <w:lsdException w:name="Light Grid Accent 1" w:semiHidden="0" w:uiPriority="62" w:unhideWhenUsed="0"/>
+    <w:lsdException w:name="Medium Shading 1 Accent 1" w:semiHidden="0" w:uiPriority="63" w:unhideWhenUsed="0"/>
+    <w:lsdException w:name="Medium Shading 2 Accent 1" w:semiHidden="0" w:uiPriority="64" w:unhideWhenUsed="0"/>
+    <w:lsdException w:name="Medium List 1 Accent 1" w:semiHidden="0" w:uiPriority="65" w:unhideWhenUsed="0"/>
+    <w:lsdException w:name="Revision" w:unhideWhenUsed="0"/>
+    <w:lsdException w:name="List Paragraph" w:semiHidden="0" w:uiPriority="34" w:unhideWhenUsed="0" w:qFormat="1"/>
+    <w:lsdException w:name="Quote" w:semiHidden="0" w:uiPriority="29" w:unhideWhenUsed="0" w:qFormat="1"/>
+    <w:lsdException w:name="Intense Quote" w:semiHidden="0" w:uiPriority="30" w:unhideWhenUsed="0" w:qFormat="1"/>
+    <w:lsdException w:name="Medium List 2 Accent 1" w:semiHidden="0" w:uiPriority="66" w:unhideWhenUsed="0"/>
+    <w:lsdException w:name="Medium Grid 1 Accent 1" w:semiHidden="0" w:uiPriority="67" w:unhideWhenUsed="0"/>
+    <w:lsdException w:name="Medium Grid 2 Accent 1" w:semiHidden="0" w:uiPriority="68" w:unhideWhenUsed="0"/>
+    <w:lsdException w:name="Medium Grid 3 Accent 1" w:semiHidden="0" w:uiPriority="69" w:unhideWhenUsed="0"/>
+    <w:lsdException w:name="Dark List Accent 1" w:semiHidden="0" w:uiPriority="70" w:unhideWhenUsed="0"/>
+    <w:lsdException w:name="Colorful Shading Accent 1" w:semiHidden="0" w:uiPriority="71" w:unhideWhenUsed="0"/>
+    <w:lsdException w:name="Colorful List Accent 1" w:semiHidden="0" w:uiPriority="72" w:unhideWhenUsed="0"/>
+    <w:lsdException w:name="Colorful Grid Accent 1" w:semiHidden="0" w:uiPriority="73" w:unhideWhenUsed="0"/>
+    <w:lsdException w:name="Light Shading Accent 2" w:semiHidden="0" w:uiPriority="60" w:unhideWhenUsed="0"/>
+    <w:lsdException w:name="Light List Accent 2" w:semiHidden="0" w:uiPriority="61" w:unhideWhenUsed="0"/>
+    <w:lsdException w:name="Light Grid Accent 2" w:semiHidden="0" w:uiPriority="62" w:unhideWhenUsed="0"/>
+    <w:lsdException w:name="Medium Shading 1 Accent 2" w:semiHidden="0" w:uiPriority="63" w:unhideWhenUsed="0"/>
+    <w:lsdException w:name="Medium Shading 2 Accent 2" w:semiHidden="0" w:uiPriority="64" w:unhideWhenUsed="0"/>
+    <w:lsdException w:name="Medium List 1 Accent 2" w:semiHidden="0" w:uiPriority="65" w:unhideWhenUsed="0"/>
+    <w:lsdException w:name="Medium List 2 Accent 2" w:semiHidden="0" w:uiPriority="66" w:unhideWhenUsed="0"/>
+    <w:lsdException w:name="Medium Grid 1 Accent 2" w:semiHidden="0" w:uiPriority="67" w:unhideWhenUsed="0"/>
+    <w:lsdException w:name="Medium Grid 2 Accent 2" w:semiHidden="0" w:uiPriority="68" w:unhideWhenUsed="0"/>
+    <w:lsdException w:name="Medium Grid 3 Accent 2" w:semiHidden="0" w:uiPriority="69" w:unhideWhenUsed="0"/>
+    <w:lsdException w:name="Dark List Accent 2" w:semiHidden="0" w:uiPriority="70" w:unhideWhenUsed="0"/>
+    <w:lsdException w:name="Colorful Shading Accent 2" w:semiHidden="0" w:uiPriority="71" w:unhideWhenUsed="0"/>
+    <w:lsdException w:name="Colorful List Accent 2" w:semiHidden="0" w:uiPriority="72" w:unhideWhenUsed="0"/>
+    <w:lsdException w:name="Colorful Grid Accent 2" w:semiHidden="0" w:uiPriority="73" w:unhideWhenUsed="0"/>
+    <w:lsdException w:name="Light Shading Accent 3" w:semiHidden="0" w:uiPriority="60" w:unhideWhenUsed="0"/>
+    <w:lsdException w:name="Light List Accent 3" w:semiHidden="0" w:uiPriority="61" w:unhideWhenUsed="0"/>
+    <w:lsdException w:name="Light Grid Accent 3" w:semiHidden="0" w:uiPriority="62" w:unhideWhenUsed="0"/>
+    <w:lsdException w:name="Medium Shading 1 Accent 3" w:semiHidden="0" w:uiPriority="63" w:unhideWhenUsed="0"/>
+    <w:lsdException w:name="Medium Shading 2 Accent 3" w:semiHidden="0" w:uiPriority="64" w:unhideWhenUsed="0"/>
+    <w:lsdException w:name="Medium List 1 Accent 3" w:semiHidden="0" w:uiPriority="65" w:unhideWhenUsed="0"/>
+    <w:lsdException w:name="Medium List 2 Accent 3" w:semiHidden="0" w:uiPriority="66" w:unhideWhenUsed="0"/>
+    <w:lsdException w:name="Medium Grid 1 Accent 3" w:semiHidden="0" w:uiPriority="67" w:unhideWhenUsed="0"/>
+    <w:lsdException w:name="Medium Grid 2 Accent 3" w:semiHidden="0" w:uiPriority="68" w:unhideWhenUsed="0"/>
+    <w:lsdException w:name="Medium Grid 3 Accent 3" w:semiHidden="0" w:uiPriority="69" w:unhideWhenUsed="0"/>
+    <w:lsdException w:name="Dark List Accent 3" w:semiHidden="0" w:uiPriority="70" w:unhideWhenUsed="0"/>
+    <w:lsdException w:name="Colorful Shading Accent 3" w:semiHidden="0" w:uiPriority="71" w:unhideWhenUsed="0"/>
+    <w:lsdException w:name="Colorful List Accent 3" w:semiHidden="0" w:uiPriority="72" w:unhideWhenUsed="0"/>
+    <w:lsdException w:name="Colorful Grid Accent 3" w:semiHidden="0" w:uiPriority="73" w:unhideWhenUsed="0"/>
+    <w:lsdException w:name="Light Shading Accent 4" w:semiHidden="0" w:uiPriority="60" w:unhideWhenUsed="0"/>
+    <w:lsdException w:name="Light List Accent 4" w:semiHidden="0" w:uiPriority="61" w:unhideWhenUsed="0"/>
+    <w:lsdException w:name="Light Grid Accent 4" w:semiHidden="0" w:uiPriority="62" w:unhideWhenUsed="0"/>
+    <w:lsdException w:name="Medium Shading 1 Accent 4" w:semiHidden="0" w:uiPriority="63" w:unhideWhenUsed="0"/>
+    <w:lsdException w:name="Medium Shading 2 Accent 4" w:semiHidden="0" w:uiPriority="64" w:unhideWhenUsed="0"/>
+    <w:lsdException w:name="Medium List 1 Accent 4" w:semiHidden="0" w:uiPriority="65" w:unhideWhenUsed="0"/>
+    <w:lsdException w:name="Medium List 2 Accent 4" w:semiHidden="0" w:uiPriority="66" w:unhideWhenUsed="0"/>
+    <w:lsdException w:name="Medium Grid 1 Accent 4" w:semiHidden="0" w:uiPriority="67" w:unhideWhenUsed="0"/>
+    <w:lsdException w:name="Medium Grid 2 Accent 4" w:semiHidden="0" w:uiPriority="68" w:unhideWhenUsed="0"/>
+    <w:lsdException w:name="Medium Grid 3 Accent 4" w:semiHidden="0" w:uiPriority="69" w:unhideWhenUsed="0"/>
+    <w:lsdException w:name="Dark List Accent 4" w:semiHidden="0" w:uiPriority="70" w:unhideWhenUsed="0"/>
+    <w:lsdException w:name="Colorful Shading Accent 4" w:semiHidden="0" w:uiPriority="71" w:unhideWhenUsed="0"/>
+    <w:lsdException w:name="Colorful List Accent 4" w:semiHidden="0" w:uiPriority="72" w:unhideWhenUsed="0"/>
+    <w:lsdException w:name="Colorful Grid Accent 4" w:semiHidden="0" w:uiPriority="73" w:unhideWhenUsed="0"/>
+    <w:lsdException w:name="Light Shading Accent 5" w:semiHidden="0" w:uiPriority="60" w:unhideWhenUsed="0"/>
+    <w:lsdException w:name="Light List Accent 5" w:semiHidden="0" w:uiPriority="61" w:unhideWhenUsed="0"/>
+    <w:lsdException w:name="Light Grid Accent 5" w:semiHidden="0" w:uiPriority="62" w:unhideWhenUsed="0"/>
+    <w:lsdException w:name="Medium Shading 1 Accent 5" w:semiHidden="0" w:uiPriority="63" w:unhideWhenUsed="0"/>
+    <w:lsdException w:name="Medium Shading 2 Accent 5" w:semiHidden="0" w:uiPriority="64" w:unhideWhenUsed="0"/>
+    <w:lsdException w:name="Medium List 1 Accent 5" w:semiHidden="0" w:uiPriority="65" w:unhideWhenUsed="0"/>
+    <w:lsdException w:name="Medium List 2 Accent 5" w:semiHidden="0" w:uiPriority="66" w:unhideWhenUsed="0"/>
+    <w:lsdException w:name="Medium Grid 1 Accent 5" w:semiHidden="0" w:uiPriority="67" w:unhideWhenUsed="0"/>
+    <w:lsdException w:name="Medium Grid 2 Accent 5" w:semiHidden="0" w:uiPriority="68" w:unhideWhenUsed="0"/>
+    <w:lsdException w:name="Medium Grid 3 Accent 5" w:semiHidden="0" w:uiPriority="69" w:unhideWhenUsed="0"/>
+    <w:lsdException w:name="Dark List Accent 5" w:semiHidden="0" w:uiPriority="70" w:unhideWhenUsed="0"/>
+    <w:lsdException w:name="Colorful Shading Accent 5" w:semiHidden="0" w:uiPriority="71" w:unhideWhenUsed="0"/>
+    <w:lsdException w:name="Colorful List Accent 5" w:semiHidden="0" w:uiPriority="72" w:unhideWhenUsed="0"/>
+    <w:lsdException w:name="Colorful Grid Accent 5" w:semiHidden="0" w:uiPriority="73" w:unhideWhenUsed="0"/>
+    <w:lsdException w:name="Light Shading Accent 6" w:semiHidden="0" w:uiPriority="60" w:unhideWhenUsed="0"/>
+    <w:lsdException w:name="Light List Accent 6" w:semiHidden="0" w:uiPriority="61" w:unhideWhenUsed="0"/>
+    <w:lsdException w:name="Light Grid Accent 6" w:semiHidden="0" w:uiPriority="62" w:unhideWhenUsed="0"/>
+    <w:lsdException w:name="Medium Shading 1 Accent 6" w:semiHidden="0" w:uiPriority="63" w:unhideWhenUsed="0"/>
+    <w:lsdException w:name="Medium Shading 2 Accent 6" w:semiHidden="0" w:uiPriority="64" w:unhideWhenUsed="0"/>
+    <w:lsdException w:name="Medium List 1 Accent 6" w:semiHidden="0" w:uiPriority="65" w:unhideWhenUsed="0"/>
+    <w:lsdException w:name="Medium List 2 Accent 6" w:semiHidden="0" w:uiPriority="66" w:unhideWhenUsed="0"/>
+    <w:lsdException w:name="Medium Grid 1 Accent 6" w:semiHidden="0" w:uiPriority="67" w:unhideWhenUsed="0"/>
+    <w:lsdException w:name="Medium Grid 2 Accent 6" w:semiHidden="0" w:uiPriority="68" w:unhideWhenUsed="0"/>
+    <w:lsdException w:name="Medium Grid 3 Accent 6" w:semiHidden="0" w:uiPriority="69" w:unhideWhenUsed="0"/>
+    <w:lsdException w:name="Dark List Accent 6" w:semiHidden="0" w:uiPriority="70" w:unhideWhenUsed="0"/>
+    <w:lsdException w:name="Colorful Shading Accent 6" w:semiHidden="0" w:uiPriority="71" w:unhideWhenUsed="0"/>
+    <w:lsdException w:name="Colorful List Accent 6" w:semiHidden="0" w:uiPriority="72" w:unhideWhenUsed="0"/>
+    <w:lsdException w:name="Colorful Grid Accent 6" w:semiHidden="0" w:uiPriority="73" w:unhideWhenUsed="0"/>
+    <w:lsdException w:name="Subtle Emphasis" w:semiHidden="0" w:uiPriority="19" w:unhideWhenUsed="0" w:qFormat="1"/>
+    <w:lsdException w:name="Intense Emphasis" w:semiHidden="0" w:uiPriority="21" w:unhideWhenUsed="0" w:qFormat="1"/>
+    <w:lsdException w:name="Subtle Reference" w:semiHidden="0" w:uiPriority="31" w:unhideWhenUsed="0" w:qFormat="1"/>
+    <w:lsdException w:name="Intense Reference" w:semiHidden="0" w:uiPriority="32" w:unhideWhenUsed="0" w:qFormat="1"/>
+    <w:lsdException w:name="Book Title" w:semiHidden="0" w:uiPriority="33" w:unhideWhenUsed="0" w:qFormat="1"/>
+    <w:lsdException w:name="Bibliography" w:uiPriority="37"/>
+    <w:lsdException w:name="TOC Heading" w:uiPriority="39" w:qFormat="1"/>
   </w:latentStyles>
   <w:style w:type="paragraph" w:default="1" w:styleId="Normal">
     <w:name w:val="Normal"/>
     <w:qFormat/>
+    <w:rsid w:val="00FE3DAF"/>
   </w:style>
-  <w:style w:type="paragraph" w:styleId="Heading2">
+  <w:style w:type="paragraph" w:styleId="Ttulo2">
     <w:name w:val="heading 2"/>
     <w:basedOn w:val="Normal"/>
-    <w:link w:val="Heading2Char"/>
+    <w:link w:val="Ttulo2Char"/>
     <w:uiPriority w:val="9"/>
     <w:qFormat/>
     <w:rsid w:val="007D6F32"/>
@@ -2519,17 +2591,18 @@
       <w:lang w:eastAsia="pt-BR"/>
     </w:rPr>
   </w:style>
-  <w:style w:type="character" w:default="1" w:styleId="DefaultParagraphFont">
+  <w:style w:type="character" w:default="1" w:styleId="Fontepargpadro">
     <w:name w:val="Default Paragraph Font"/>
     <w:uiPriority w:val="1"/>
     <w:semiHidden/>
     <w:unhideWhenUsed/>
   </w:style>
-  <w:style w:type="table" w:default="1" w:styleId="TableNormal">
+  <w:style w:type="table" w:default="1" w:styleId="Tabelanormal">
     <w:name w:val="Normal Table"/>
     <w:uiPriority w:val="99"/>
     <w:semiHidden/>
     <w:unhideWhenUsed/>
+    <w:qFormat/>
     <w:tblPr>
       <w:tblInd w:w="0" w:type="dxa"/>
       <w:tblCellMar>
@@ -2540,16 +2613,16 @@
       </w:tblCellMar>
     </w:tblPr>
   </w:style>
-  <w:style w:type="numbering" w:default="1" w:styleId="NoList">
+  <w:style w:type="numbering" w:default="1" w:styleId="Semlista">
     <w:name w:val="No List"/>
     <w:uiPriority w:val="99"/>
     <w:semiHidden/>
     <w:unhideWhenUsed/>
   </w:style>
-  <w:style w:type="character" w:customStyle="1" w:styleId="Heading2Char">
-    <w:name w:val="Heading 2 Char"/>
-    <w:basedOn w:val="DefaultParagraphFont"/>
-    <w:link w:val="Heading2"/>
+  <w:style w:type="character" w:customStyle="1" w:styleId="Ttulo2Char">
+    <w:name w:val="Título 2 Char"/>
+    <w:basedOn w:val="Fontepargpadro"/>
+    <w:link w:val="Ttulo2"/>
     <w:uiPriority w:val="9"/>
     <w:rsid w:val="007D6F32"/>
     <w:rPr>
@@ -2561,9 +2634,9 @@
       <w:lang w:eastAsia="pt-BR"/>
     </w:rPr>
   </w:style>
-  <w:style w:type="character" w:styleId="Strong">
+  <w:style w:type="character" w:styleId="Forte">
     <w:name w:val="Strong"/>
-    <w:basedOn w:val="DefaultParagraphFont"/>
+    <w:basedOn w:val="Fontepargpadro"/>
     <w:uiPriority w:val="22"/>
     <w:qFormat/>
     <w:rsid w:val="007D6F32"/>
@@ -2588,6 +2661,52 @@
       <w:szCs w:val="24"/>
       <w:lang w:eastAsia="pt-BR"/>
     </w:rPr>
+  </w:style>
+  <w:style w:type="paragraph" w:styleId="Cabealho">
+    <w:name w:val="header"/>
+    <w:basedOn w:val="Normal"/>
+    <w:link w:val="CabealhoChar"/>
+    <w:uiPriority w:val="99"/>
+    <w:semiHidden/>
+    <w:unhideWhenUsed/>
+    <w:rsid w:val="00AF6AD9"/>
+    <w:pPr>
+      <w:tabs>
+        <w:tab w:val="center" w:pos="4252"/>
+        <w:tab w:val="right" w:pos="8504"/>
+      </w:tabs>
+      <w:spacing w:after="0" w:line="240" w:lineRule="auto"/>
+    </w:pPr>
+  </w:style>
+  <w:style w:type="character" w:customStyle="1" w:styleId="CabealhoChar">
+    <w:name w:val="Cabeçalho Char"/>
+    <w:basedOn w:val="Fontepargpadro"/>
+    <w:link w:val="Cabealho"/>
+    <w:uiPriority w:val="99"/>
+    <w:semiHidden/>
+    <w:rsid w:val="00AF6AD9"/>
+  </w:style>
+  <w:style w:type="paragraph" w:styleId="Rodap">
+    <w:name w:val="footer"/>
+    <w:basedOn w:val="Normal"/>
+    <w:link w:val="RodapChar"/>
+    <w:uiPriority w:val="99"/>
+    <w:unhideWhenUsed/>
+    <w:rsid w:val="00AF6AD9"/>
+    <w:pPr>
+      <w:tabs>
+        <w:tab w:val="center" w:pos="4252"/>
+        <w:tab w:val="right" w:pos="8504"/>
+      </w:tabs>
+      <w:spacing w:after="0" w:line="240" w:lineRule="auto"/>
+    </w:pPr>
+  </w:style>
+  <w:style w:type="character" w:customStyle="1" w:styleId="RodapChar">
+    <w:name w:val="Rodapé Char"/>
+    <w:basedOn w:val="Fontepargpadro"/>
+    <w:link w:val="Rodap"/>
+    <w:uiPriority w:val="99"/>
+    <w:rsid w:val="00AF6AD9"/>
   </w:style>
 </w:styles>
 </file>
@@ -2635,7 +2754,7 @@
     </a:clrScheme>
     <a:fontScheme name="Office">
       <a:majorFont>
-        <a:latin typeface="Calibri Light" panose="020F0302020204030204"/>
+        <a:latin typeface="Calibri Light"/>
         <a:ea typeface=""/>
         <a:cs typeface=""/>
         <a:font script="Jpan" typeface="游ゴシック Light"/>
@@ -2687,7 +2806,7 @@
         <a:font script="Tfng" typeface="Ebrima"/>
       </a:majorFont>
       <a:minorFont>
-        <a:latin typeface="Calibri" panose="020F0502020204030204"/>
+        <a:latin typeface="Calibri"/>
         <a:ea typeface=""/>
         <a:cs typeface=""/>
         <a:font script="Jpan" typeface="游明朝"/>
@@ -2881,7 +3000,7 @@
   <a:extraClrSchemeLst/>
   <a:extLst>
     <a:ext uri="{05A4C25C-085E-4340-85A3-A5531E510DB2}">
-      <thm15:themeFamily xmlns:thm15="http://schemas.microsoft.com/office/thememl/2012/main" name="Office Theme" id="{62F939B6-93AF-4DB8-9C6B-D6C7DFDC589F}" vid="{4A3C46E8-61CC-4603-A589-7422A47A8E4A}"/>
+      <thm15:themeFamily xmlns:thm15="http://schemas.microsoft.com/office/thememl/2012/main" xmlns="" name="Office Theme" id="{62F939B6-93AF-4DB8-9C6B-D6C7DFDC589F}" vid="{4A3C46E8-61CC-4603-A589-7422A47A8E4A}"/>
     </a:ext>
   </a:extLst>
 </a:theme>

</xml_diff>